<commit_message>
submission: link the documentation, deck and poster to the FA26-COLLIE repository
The hackathon work is exported cleanly into https://github.com/nocdoggo/FA26-COLLIE. The docx
repository rows and clone commands, the deck's closing slide, the poster footer and both QR codes
now point there, and the submission README and checklist say where the full history lives.
</commit_message>
<xml_diff>
--- a/PEEAI_plan/submission/documentation/Plan_B_Project_Documentation.docx
+++ b/PEEAI_plan/submission/documentation/Plan_B_Project_Documentation.docx
@@ -233,7 +233,7 @@
                   <w:sz w:val="19"/>
                   <w:u w:val="single"/>
                 </w:rPr>
-                <w:t>https://github.com/nocdoggo/COLLIE/tree/hackathon/peeaai-plan/apps/plan_b</w:t>
+                <w:t>https://github.com/nocdoggo/FA26-COLLIE</w:t>
               </w:r>
             </w:hyperlink>
           </w:p>
@@ -256,7 +256,7 @@
                 <w:b w:val="0"/>
                 <w:sz w:val="19"/>
               </w:rPr>
-              <w:t>Branch and app path</w:t>
+              <w:t>App and submission paths</w:t>
             </w:r>
           </w:p>
         </w:tc>
@@ -273,14 +273,28 @@
                 <w:b w:val="0"/>
                 <w:sz w:val="19"/>
               </w:rPr>
-              <w:t xml:space="preserve">branch </w:t>
+              <w:t xml:space="preserve">the app is in </w:t>
             </w:r>
             <w:r>
               <w:rPr>
                 <w:rStyle w:val="InlineCode"/>
                 <w:sz w:val="19"/>
               </w:rPr>
-              <w:t>hackathon/peeaai-plan</w:t>
+              <w:t>apps/plan_b</w:t>
+            </w:r>
+            <w:r>
+              <w:rPr>
+                <w:b w:val="0"/>
+                <w:sz w:val="19"/>
+              </w:rPr>
+              <w:t xml:space="preserve"> and the submission items are in </w:t>
+            </w:r>
+            <w:r>
+              <w:rPr>
+                <w:rStyle w:val="InlineCode"/>
+                <w:sz w:val="19"/>
+              </w:rPr>
+              <w:t>PEEAI_plan/submission</w:t>
             </w:r>
             <w:r>
               <w:rPr>
@@ -294,21 +308,7 @@
                 <w:rStyle w:val="InlineCode"/>
                 <w:sz w:val="19"/>
               </w:rPr>
-              <w:t>nocdoggo/COLLIE</w:t>
-            </w:r>
-            <w:r>
-              <w:rPr>
-                <w:b w:val="0"/>
-                <w:sz w:val="19"/>
-              </w:rPr>
-              <w:t xml:space="preserve">, app in </w:t>
-            </w:r>
-            <w:r>
-              <w:rPr>
-                <w:rStyle w:val="InlineCode"/>
-                <w:sz w:val="19"/>
-              </w:rPr>
-              <w:t>apps/plan_b</w:t>
+              <w:t>nocdoggo/FA26-COLLIE</w:t>
             </w:r>
           </w:p>
         </w:tc>
@@ -9840,7 +9840,7 @@
             <w:color w:val="0563C1"/>
             <w:u w:val="single"/>
           </w:rPr>
-          <w:t>https://github.com/nocdoggo/COLLIE/tree/hackathon/peeaai-plan/apps/plan_b</w:t>
+          <w:t>https://github.com/nocdoggo/FA26-COLLIE</w:t>
         </w:r>
       </w:hyperlink>
     </w:p>
@@ -9857,7 +9857,7 @@
         <w:pStyle w:val="Code"/>
       </w:pPr>
       <w:r>
-        <w:t>git clone --branch hackathon/peeaai-plan https://github.com/nocdoggo/COLLIE</w:t>
+        <w:t>git clone https://github.com/nocdoggo/FA26-COLLIE</w:t>
       </w:r>
     </w:p>
     <w:p>
@@ -9865,7 +9865,7 @@
         <w:pStyle w:val="Code"/>
       </w:pPr>
       <w:r>
-        <w:t>cd COLLIE/apps/plan_b</w:t>
+        <w:t>cd FA26-COLLIE/apps/plan_b</w:t>
       </w:r>
     </w:p>
     <w:p>
@@ -9960,7 +9960,7 @@
         <w:rPr>
           <w:rStyle w:val="InlineCode"/>
         </w:rPr>
-        <w:t>COLLIE/apps/plan_b</w:t>
+        <w:t>FA26-COLLIE/apps/plan_b</w:t>
       </w:r>
       <w:r>
         <w:rPr>
@@ -10131,7 +10131,7 @@
         <w:rPr>
           <w:rStyle w:val="InlineCode"/>
         </w:rPr>
-        <w:t>COLLIE/apps/plan_b</w:t>
+        <w:t>FA26-COLLIE/apps/plan_b</w:t>
       </w:r>
       <w:r>
         <w:rPr>

</xml_diff>

<commit_message>
submission: the deadline fixes from FA26-COLLIE, one final system, plain names and the story figure
Brings the submission repository's last commits (fd05b43 to 12e40a9) into this branch: the poster
drops its sandbox footer and two-version band, the deck and poster present one final system with
plain names instead of case and policy codes, the docx body uses the same names, and a four-beat
story figure opens the deck and the poster.
</commit_message>
<xml_diff>
--- a/PEEAI_plan/submission/documentation/Plan_B_Project_Documentation.docx
+++ b/PEEAI_plan/submission/documentation/Plan_B_Project_Documentation.docx
@@ -567,7 +567,7 @@
         <w:rPr>
           <w:b w:val="0"/>
         </w:rPr>
-        <w:t>Plan B combines known ideas in one bounded workflow. It does not claim to be the first of its kind. P0 to P3 are the four coordinator policies compared in section 7.</w:t>
+        <w:t>Plan B combines known ideas in one bounded workflow. It does not claim to be the first of its kind. The four coordinator policies are the ones compared in section 7.</w:t>
       </w:r>
     </w:p>
     <w:p>
@@ -584,7 +584,7 @@
         <w:rPr>
           <w:b w:val="0"/>
         </w:rPr>
-        <w:t xml:space="preserve"> let the model write tool calls directly. Plan B keeps that design as a comparison policy (P1), and in its own policy (P2) the model picks one option from a menu the server built and checked.</w:t>
+        <w:t xml:space="preserve"> let the model write tool calls directly. Plan B keeps that design as a comparison policy (the tool-calling model), and in its own policy (our coordinator) the model picks one option from a menu the server built and checked.</w:t>
       </w:r>
     </w:p>
     <w:p>
@@ -601,7 +601,7 @@
         <w:rPr>
           <w:b w:val="0"/>
         </w:rPr>
-        <w:t xml:space="preserve"> are predictable but read only the message forms they were written for. Plan B keeps a published rule policy (P0) as a baseline.</w:t>
+        <w:t xml:space="preserve"> are predictable but read only the message forms they were written for. Plan B keeps a published rule policy (the fixed rules) as a baseline.</w:t>
       </w:r>
     </w:p>
     <w:p>
@@ -1590,7 +1590,7 @@
         <w:rPr>
           <w:b w:val="0"/>
         </w:rPr>
-        <w:t xml:space="preserve">The frames above come from an automated browser run of the rule baseline (P0), with no model call. In a recorded development run, the AI coordinator (P2) made the same status check and the same swap at 16:43 with receipt </w:t>
+        <w:t xml:space="preserve">The frames above come from an automated browser run of the rule baseline (the fixed rules), with no model call. In a recorded development run, the AI coordinator (our coordinator) made the same status check and the same swap at 16:43 with receipt </w:t>
       </w:r>
       <w:r>
         <w:rPr>
@@ -2139,7 +2139,7 @@
                 <w:b w:val="0"/>
                 <w:sz w:val="19"/>
               </w:rPr>
-              <w:t>Rule policies (P0)</w:t>
+              <w:t>Rule policies (the fixed rules)</w:t>
             </w:r>
           </w:p>
         </w:tc>
@@ -2195,7 +2195,7 @@
                 <w:b w:val="0"/>
                 <w:sz w:val="19"/>
               </w:rPr>
-              <w:t>Model policies (P1 to P3)</w:t>
+              <w:t>Model policies (the tool-calling model to the check-all variant)</w:t>
             </w:r>
           </w:p>
         </w:tc>
@@ -2490,7 +2490,7 @@
         <w:rPr>
           <w:b w:val="0"/>
         </w:rPr>
-        <w:t>The selective policy P2 follows these steps each time the runner wakes it, that is, gives it a turn because the shared state changed or a wait it set has passed:</w:t>
+        <w:t>The selective policy our coordinator follows these steps each time the runner wakes it, that is, gives it a turn because the shared state changed or a wait it set has passed:</w:t>
       </w:r>
     </w:p>
     <w:p>
@@ -2995,7 +2995,7 @@
         <w:rPr>
           <w:b w:val="0"/>
         </w:rPr>
-        <w:t xml:space="preserve"> through OpenRouter, the same configuration for P1 to P3, 4096 output tokens per call, strict JSON output.</w:t>
+        <w:t xml:space="preserve"> through OpenRouter, the same configuration for the tool-calling model to the check-all variant, 4096 output tokens per call, strict JSON output.</w:t>
       </w:r>
     </w:p>
     <w:p>
@@ -3040,13 +3040,13 @@
         <w:rPr>
           <w:b/>
         </w:rPr>
-        <w:t>P1 is a serious baseline.</w:t>
+        <w:t>the tool-calling model is a serious baseline.</w:t>
       </w:r>
       <w:r>
         <w:rPr>
           <w:b w:val="0"/>
         </w:rPr>
-        <w:t xml:space="preserve"> It sees the objective, the budget, the tools and the candidates, and may verify and hold like P2.</w:t>
+        <w:t xml:space="preserve"> It sees the objective, the budget, the tools and the candidates, and may verify and hold like our coordinator.</w:t>
       </w:r>
     </w:p>
     <w:p>
@@ -3057,7 +3057,7 @@
         <w:rPr>
           <w:b/>
         </w:rPr>
-        <w:t>P3 is an ablation.</w:t>
+        <w:t>the check-all variant is an ablation.</w:t>
       </w:r>
       <w:r>
         <w:rPr>
@@ -4431,7 +4431,7 @@
         <w:rPr>
           <w:b w:val="0"/>
         </w:rPr>
-        <w:t>: 80 campus runs (8 cases, P0 once, P1 to P3 three times each) and, separately, 40 pantry runs. The two suites are never pooled.</w:t>
+        <w:t>: 80 campus runs (8 cases, the fixed rules once, the tool-calling model to the check-all variant three times each) and, separately, 40 pantry runs. The two suites are never pooled.</w:t>
       </w:r>
     </w:p>
     <w:p>
@@ -4571,13 +4571,13 @@
         <w:rPr>
           <w:b/>
         </w:rPr>
-        <w:t>P2, my policy, shows no consistent advantage over P1 or P0 here.</w:t>
+        <w:t>our coordinator, my policy, shows no consistent advantage over the tool-calling model or the fixed rules here.</w:t>
       </w:r>
       <w:r>
         <w:rPr>
           <w:b w:val="0"/>
         </w:rPr>
-        <w:t xml:space="preserve"> On one reported run of 8 campus and 4 pantry held-out cases, P2 met every run of 6 of 8 campus cases (P1 met every run of 8, P3 of 7, P0 of 6) and of 3 of 4 pantry cases (P0 of 4, P1 of 2, P3 of 2). Its misses come from a frozen attention rule that passes only equipment notices to the planner (C06), choices that used up the 8-call limit (C07) and an unavailable pool kept as a handoff option (T03). A first attempt was voided, as section 12.5 explains.</w:t>
+        <w:t xml:space="preserve"> On one reported run of 8 campus and 4 pantry held-out cases, our coordinator met every run of 6 of 8 campus cases (the tool-calling model met every run of 8, the check-all variant of 7, the fixed rules of 6) and of 3 of 4 pantry cases (the fixed rules of 4, the tool-calling model of 2, the check-all variant of 2). Its misses come from a frozen attention rule that passes only equipment notices to the planner (C06), choices that used up the 8-call limit (C07) and an unavailable pool kept as a handoff option (T03). A first attempt was voided, as section 12.5 explains.</w:t>
       </w:r>
     </w:p>
     <w:p>
@@ -7295,7 +7295,7 @@
         <w:rPr>
           <w:b w:val="0"/>
         </w:rPr>
-        <w:t xml:space="preserve"> In C06 (a volunteer will be late, with a later check-in), P2 and P3 read the volunteer's message correctly in all six runs. But the frozen attention rule treats only equipment notices as material, so the reading never reached the planner, the plan was never put in question, and the activity the volunteer leads could not start in time. The earliest broken stage is planner input. P0's parser does not read the message. P1 met C06 in 3 of 3 runs. This limit was disclosed at the case lock, before the runs.</w:t>
+        <w:t xml:space="preserve"> In C06 (a volunteer will be late, with a later check-in), our coordinator and the check-all variant read the volunteer's message correctly in all six runs. But the frozen attention rule treats only equipment notices as material, so the reading never reached the planner, the plan was never put in question, and the activity the volunteer leads could not start in time. The earliest broken stage is planner input. P0's parser does not read the message. The tool-calling model met C06 in 3 of 3 runs. This limit was disclosed at the case lock, before the runs.</w:t>
       </w:r>
     </w:p>
     <w:p>
@@ -7347,7 +7347,7 @@
         <w:rPr>
           <w:b w:val="0"/>
         </w:rPr>
-        <w:t>Figure 15. The C06 failure of P2 and P3 in four steps.</w:t>
+        <w:t>Figure 15. The C06 failure of our coordinator and the check-all variant in four steps.</w:t>
       </w:r>
     </w:p>
     <w:p>
@@ -7384,7 +7384,7 @@
         <w:rPr>
           <w:b w:val="0"/>
         </w:rPr>
-        <w:t xml:space="preserve"> (status service unavailable), P2 in 3 runs, action selection: a repeated check and a hold released and made again used the 8 model calls, and the organizer's approval arrived after the last one. P0 missed C07 too (interpretation), because its parser does not read the message.</w:t>
+        <w:t xml:space="preserve"> (status service unavailable), our coordinator in 3 runs, action selection: a repeated check and a hold released and made again used the 8 model calls, and the organizer's approval arrived after the last one. The fixed rules missed C07 too (interpretation), because its parser does not read the message.</w:t>
       </w:r>
     </w:p>
     <w:p>
@@ -7401,7 +7401,7 @@
         <w:rPr>
           <w:b w:val="0"/>
         </w:rPr>
-        <w:t>, P3 in 3 runs, execution: a correct apply was refused as stale during a one-minute tool call, and the remaining model calls went to reading new notices, so it was never retried.</w:t>
+        <w:t>, the check-all variant in 3 runs, execution: a correct apply was refused as stale during a one-minute tool call, and the remaining model calls went to reading new notices, so it was never retried.</w:t>
       </w:r>
     </w:p>
     <w:p>
@@ -7418,7 +7418,7 @@
         <w:rPr>
           <w:b w:val="0"/>
         </w:rPr>
-        <w:t>, P1 in 6 runs, action selection: P1 never held or committed the kits on hand.</w:t>
+        <w:t>, the tool-calling model in 6 runs, action selection: the tool-calling model never held or committed the kits on hand.</w:t>
       </w:r>
     </w:p>
     <w:p>
@@ -7435,7 +7435,7 @@
         <w:rPr>
           <w:b w:val="0"/>
         </w:rPr>
-        <w:t>, P2 and P3 in 3 runs each, planner input (for P2 borderline with action selection): a defect in my frozen planner and menu kept a pool checked as unavailable as a ranked handoff option, and the shortfall report waited on it.</w:t>
+        <w:t>, our coordinator and the check-all variant in 3 runs each, planner input (for our coordinator borderline with action selection): a defect in my frozen planner and menu kept a pool checked as unavailable as a ranked handoff option, and the shortfall report waited on it.</w:t>
       </w:r>
     </w:p>
     <w:p>
@@ -7468,7 +7468,7 @@
         <w:rPr>
           <w:b w:val="0"/>
         </w:rPr>
-        <w:t xml:space="preserve"> P1, the model calling tools freely, met all campus runs, with the most model use: 90 model calls and $3.01 on campus, against $1.00 for P2 and $0.57 for P3. On the pantry, fixed rules met 4/4 runs at no model cost, while the model policies met 6 to 9 of 12. P2 cost less than P1 (P3, with the same menu and server checks, cost less still on campus), and its misses trace to its frozen attention rule, choices that used up the call limit and the planner defect. These counts come from one reported run and do not show that any policy is better in general.</w:t>
+        <w:t xml:space="preserve"> the tool-calling model, the model calling tools freely, met all campus runs, with the most model use: 90 model calls and $3.01 on campus, against $1.00 for our coordinator and $0.57 for the check-all variant. On the pantry, fixed rules met 4/4 runs at no model cost, while the model policies met 6 to 9 of 12. Our coordinator cost less than the tool-calling model (the check-all variant, with the same menu and server checks, cost less still on campus), and its misses trace to its frozen attention rule, choices that used up the call limit and the planner defect. These counts come from one reported run and do not show that any policy is better in general.</w:t>
       </w:r>
     </w:p>
     <w:p>
@@ -7513,7 +7513,7 @@
         <w:rPr>
           <w:b w:val="0"/>
         </w:rPr>
-        <w:t xml:space="preserve"> Only P2 and P3 had pantry guidance in their prompts, so the pantry partial-fulfillment counts cannot be credited to the controller alone.</w:t>
+        <w:t xml:space="preserve"> Only our coordinator and the check-all variant had pantry guidance in their prompts, so the pantry partial-fulfillment counts cannot be credited to the controller alone.</w:t>
       </w:r>
     </w:p>
     <w:p>
@@ -7703,7 +7703,7 @@
         <w:rPr>
           <w:b w:val="0"/>
         </w:rPr>
-        <w:t xml:space="preserve"> names them. Version 1.2 (P1 </w:t>
+        <w:t xml:space="preserve"> names them. Version 1.2 (the tool-calling model </w:t>
       </w:r>
       <w:r>
         <w:rPr>
@@ -7715,7 +7715,7 @@
         <w:rPr>
           <w:b w:val="0"/>
         </w:rPr>
-        <w:t xml:space="preserve">, P2 </w:t>
+        <w:t xml:space="preserve">, our coordinator </w:t>
       </w:r>
       <w:r>
         <w:rPr>
@@ -7727,7 +7727,7 @@
         <w:rPr>
           <w:b w:val="0"/>
         </w:rPr>
-        <w:t xml:space="preserve">, P3 </w:t>
+        <w:t xml:space="preserve">, the check-all variant </w:t>
       </w:r>
       <w:r>
         <w:rPr>
@@ -7819,7 +7819,7 @@
         <w:rPr>
           <w:b w:val="0"/>
         </w:rPr>
-        <w:t xml:space="preserve"> (T02). In 1.1 a choice refused only because the state had changed went back to the model. In 1.2 P2 and P3 send it again without a model call when the re-read menu still offers it.</w:t>
+        <w:t xml:space="preserve"> (T02). In 1.1 a choice refused only because the state had changed went back to the model. In 1.2 our coordinator and the check-all variant send it again without a model call when the re-read menu still offers it.</w:t>
       </w:r>
     </w:p>
     <w:p>
@@ -9402,7 +9402,7 @@
         <w:rPr>
           <w:b w:val="0"/>
         </w:rPr>
-        <w:t>). Version 1.2 met the outcome in 59 of 60 runs. The one miss is P0 on C11, a late volunteer whose own report P0's frozen parser does not read, the same gap by construction as P0 on C06. P1, P2 and P3 met every run, 12/12 each on campus and 6/6 each on the pantry. No run reached the 8-call limit, all 194 model calls were answered, and the negative control C10 had no committed change in any of its 10 runs.</w:t>
+        <w:t>). Version 1.2 met the outcome in 59 of 60 runs. The one miss is the fixed rules on C11, a late volunteer whose own report P0's frozen parser does not read, the same gap by construction as the fixed rules on C06. The tool-calling model, our coordinator and the check-all variant met every run, 12/12 each on campus and 6/6 each on the pantry. No run reached the 8-call limit, all 194 model calls were answered, and the negative control C10 had no committed change in any of its 10 runs.</w:t>
       </w:r>
     </w:p>
     <w:p>
@@ -9430,13 +9430,13 @@
         <w:rPr>
           <w:b/>
         </w:rPr>
-        <w:t>P2 still shows no consistent advantage.</w:t>
+        <w:t>our coordinator still shows no consistent advantage.</w:t>
       </w:r>
       <w:r>
         <w:rPr>
           <w:b w:val="0"/>
         </w:rPr>
-        <w:t xml:space="preserve"> P1, P2 and P3 all met every fresh run, so the fresh set cannot separate them. Model charges over both fresh suites were $2.32 for P1, $0.76 for P2 and $0.53 for P3.</w:t>
+        <w:t xml:space="preserve"> the tool-calling model, our coordinator and the check-all variant all met every fresh run, so the fresh set cannot separate them. Model charges over both fresh suites were $2.32 for the tool-calling model, $0.76 for our coordinator and $0.53 for the check-all variant.</w:t>
       </w:r>
     </w:p>
     <w:p>
@@ -9465,7 +9465,7 @@
         <w:rPr>
           <w:b w:val="0"/>
         </w:rPr>
-        <w:t>). Its counts are consistent with the fixes on the failures that motivated them: the C06 misses of P2 and P3 and the T03 misses did not recur. The C07 failure of P2 (a hold made, released and made again until the call limit) and the T02 failure of P3 (an apply refused as stale, whose retry needed a model call that the limit did not leave) remain, and P1 missed T04 in two of three runs. The fixes were made after reading these cases, so the rerun cannot show that 1.2 is better.</w:t>
+        <w:t>). Its counts are consistent with the fixes on the failures that motivated them: the C06 misses of our coordinator and the check-all variant and the T03 misses did not recur. The C07 failure of our coordinator (a hold made, released and made again until the call limit) and the T02 failure of the check-all variant (an apply refused as stale, whose retry needed a model call that the limit did not leave) remain, and the tool-calling model missed T04 in two of three runs. The fixes were made after reading these cases, so the rerun cannot show that 1.2 is better.</w:t>
       </w:r>
     </w:p>
     <w:p>
@@ -9611,7 +9611,7 @@
         <w:rPr>
           <w:b w:val="0"/>
         </w:rPr>
-        <w:t xml:space="preserve">, found by the audit before the freeze and left frozen: a person's delay hypothesis outlives a later check-in, the declined-menu rule holds no time (so a timed wake with the same options gets no model call), P1 notes a declined menu with the view after its turn, a stale re-send is recorded as a model choice, and a long </w:t>
+        <w:t xml:space="preserve">, found by the audit before the freeze and left frozen: a person's delay hypothesis outlives a later check-in, the declined-menu rule holds no time (so a timed wake with the same options gets no model call), the tool-calling model notes a declined menu with the view after its turn, a stale re-send is recorded as a model choice, and a long </w:t>
       </w:r>
       <w:r>
         <w:rPr>
@@ -9703,7 +9703,7 @@
         <w:rPr>
           <w:b w:val="0"/>
         </w:rPr>
-        <w:t xml:space="preserve"> A P2 versus P0 difference does not separate the decision policy from language reading.</w:t>
+        <w:t xml:space="preserve"> A our coordinator versus the fixed rules difference does not separate the decision policy from language reading.</w:t>
       </w:r>
     </w:p>
     <w:p>
@@ -10174,7 +10174,7 @@
         <w:rPr>
           <w:b w:val="0"/>
         </w:rPr>
-        <w:t xml:space="preserve">The model policies P1 to P3 make paid calls. They need an OpenAI-compatible endpoint such as OpenRouter, set in </w:t>
+        <w:t xml:space="preserve">The model policies the tool-calling model to the check-all variant make paid calls. They need an OpenAI-compatible endpoint such as OpenRouter, set in </w:t>
       </w:r>
       <w:r>
         <w:rPr>
@@ -11458,7 +11458,7 @@
                 <w:b w:val="0"/>
                 <w:sz w:val="19"/>
               </w:rPr>
-              <w:t>The rule that picks the next step: P0 to P3</w:t>
+              <w:t>The rule that picks the next step: the fixed rules to P3</w:t>
             </w:r>
           </w:p>
         </w:tc>
@@ -11480,7 +11480,7 @@
                 <w:b w:val="0"/>
                 <w:sz w:val="19"/>
               </w:rPr>
-              <w:t>P0, P1, P2, P3</w:t>
+              <w:t>P0, the tool-calling model, our coordinator, P3</w:t>
             </w:r>
           </w:p>
         </w:tc>
@@ -11497,7 +11497,7 @@
                 <w:b w:val="0"/>
                 <w:sz w:val="19"/>
               </w:rPr>
-              <w:t>Fixed rules, a model calling tools, a model picking checked options, and P2 with every check</w:t>
+              <w:t>Fixed rules, a model calling tools, a model picking checked options, and our coordinator with every check</w:t>
             </w:r>
           </w:p>
         </w:tc>
@@ -12004,7 +12004,7 @@
                 <w:b w:val="0"/>
                 <w:sz w:val="19"/>
               </w:rPr>
-              <w:t>The P2 and P3 rule that decides whether a reading is material and needs the model</w:t>
+              <w:t>The our coordinator and the check-all variant rule that decides whether a reading is material and needs the model</w:t>
             </w:r>
           </w:p>
         </w:tc>
@@ -12457,7 +12457,7 @@
                 <w:b w:val="0"/>
                 <w:sz w:val="19"/>
               </w:rPr>
-              <w:t>The development runs of P1 to P3</w:t>
+              <w:t>The development runs of the tool-calling model to P3</w:t>
             </w:r>
           </w:p>
         </w:tc>

</xml_diff>

<commit_message>
submission: the redesigned story and polished TeX figures for the deck, poster and documentation
</commit_message>
<xml_diff>
--- a/PEEAI_plan/submission/documentation/Plan_B_Project_Documentation.docx
+++ b/PEEAI_plan/submission/documentation/Plan_B_Project_Documentation.docx
@@ -328,7 +328,7 @@
         <w:rPr>
           <w:b w:val="0"/>
         </w:rPr>
-        <w:t xml:space="preserve">Small community events run on volunteers, borrowed equipment and fixed rooms. A single late delivery or stale message can push an organizer into a rushed change that costs people their time. </w:t>
+        <w:t xml:space="preserve">Small community events run on volunteers, borrowed equipment and fixed rooms. Twenty minutes before the doors open, a single text such as "the projector may be late" can push an organizer into a rushed change, and an AI agent that acts on that text at once can spend money on a rumor. </w:t>
       </w:r>
       <w:r>
         <w:rPr>
@@ -340,31 +340,31 @@
         <w:rPr>
           <w:b w:val="0"/>
         </w:rPr>
-        <w:t xml:space="preserve"> is a coordinator agent that decides what to verify, what to prepare and when to commit a change, inside written limits it cannot exceed. A language model reads each message and picks one of the options the server has built and checked. A </w:t>
+        <w:t xml:space="preserve"> is a coordinator that decides what to verify, what to prepare and when to commit a change, inside written limits it cannot exceed. The language model never acts on its own: it reads each message and picks one of the options the server has built and checked. Every change passes one gate that checks the role, the plan version and the budget and writes a </w:t>
       </w:r>
       <w:r>
         <w:rPr>
           <w:b/>
         </w:rPr>
+        <w:t>receipt</w:t>
+      </w:r>
+      <w:r>
+        <w:rPr>
+          <w:b w:val="0"/>
+        </w:rPr>
+        <w:t xml:space="preserve">, a </w:t>
+      </w:r>
+      <w:r>
+        <w:rPr>
+          <w:b/>
+        </w:rPr>
         <w:t>hold</w:t>
       </w:r>
       <w:r>
         <w:rPr>
           <w:b w:val="0"/>
         </w:rPr>
-        <w:t xml:space="preserve"> keeps a backup open while a fact or an approval is pending, and every accepted change returns a </w:t>
-      </w:r>
-      <w:r>
-        <w:rPr>
-          <w:b/>
-        </w:rPr>
-        <w:t>receipt</w:t>
-      </w:r>
-      <w:r>
-        <w:rPr>
-          <w:b w:val="0"/>
-        </w:rPr>
-        <w:t>. I built Plan B as a fictional local sandbox with a campus showcase, a community skills exchange and a fictional pantry, and compared four coordinator policies on held-out cases that were locked before the test. In 120 held-out runs of version 1.1, the evaluation of record, no policy executed a violation or changed a quiet event, but my policy showed no consistent advantage: a model calling the tools freely met every campus run at three times my policy's model cost, and fixed rules met every pantry run. That run exposed defects, so I made version 1.2 and tested it on a fresh held-out set of six cases, locked before any 1.2 call. It met the expected outcome in 59 of 60 runs, and the one miss was the fixed rules on a late-volunteer case. That set is small and repeats known conditions in new cases, so it is not comparable with the first run. Everything is fictional and local, the case set is small, and no community pilot has been run.</w:t>
+        <w:t xml:space="preserve"> keeps a backup open for free while a fact or an approval is pending, and checks are selective, so only a fact that could change the decision is verified. I built Plan B as a fictional local sandbox with a campus showcase, a community skills exchange and a fictional pantry. The final system was frozen and run on 6 new cases, written by a separate worker before the final freeze and locked in the same commit, before the first model call. The author of the code changes never read them. 59 of 60 runs met the expected outcome. Our coordinator met all 18 of its 18 runs, as did the two other model-based approaches, and the one miss was the fixed rules on a case where a volunteer runs late. No executed action broke a rule, because every change passes the gate. Six cases cannot rank the approaches. An earlier locked test of 12 cases (120 runs) found the defects fixed before the final freeze, and its cases are now development cases. Section 12 keeps that complete record. Everything is fictional and local, and no community pilot has been run.</w:t>
       </w:r>
     </w:p>
     <w:p>
@@ -375,7 +375,7 @@
       <w:r>
         <w:drawing>
           <wp:inline xmlns:a="http://schemas.openxmlformats.org/drawingml/2006/main" xmlns:pic="http://schemas.openxmlformats.org/drawingml/2006/picture">
-            <wp:extent cx="5943600" cy="829746"/>
+            <wp:extent cx="5943600" cy="2761505"/>
             <wp:docPr id="1" name="Picture 1"/>
             <wp:cNvGraphicFramePr>
               <a:graphicFrameLocks noChangeAspect="1"/>
@@ -384,7 +384,7 @@
               <a:graphicData uri="http://schemas.openxmlformats.org/drawingml/2006/picture">
                 <pic:pic>
                   <pic:nvPicPr>
-                    <pic:cNvPr id="0" name="fig_strip.png"/>
+                    <pic:cNvPr id="0" name="fig_story.png"/>
                     <pic:cNvPicPr/>
                   </pic:nvPicPr>
                   <pic:blipFill>
@@ -396,7 +396,7 @@
                   <pic:spPr>
                     <a:xfrm>
                       <a:off x="0" y="0"/>
-                      <a:ext cx="5943600" cy="829746"/>
+                      <a:ext cx="5943600" cy="2761505"/>
                     </a:xfrm>
                     <a:prstGeom prst="rect"/>
                   </pic:spPr>
@@ -416,7 +416,7 @@
         <w:rPr>
           <w:b w:val="0"/>
         </w:rPr>
-        <w:t>Figure 1. One recovery in four steps (development case dev01).</w:t>
+        <w:t>Figure 1. The late projector, beat by beat, and the program before and after the free swap (a development run in the sandbox).</w:t>
       </w:r>
     </w:p>
     <w:p>
@@ -432,7 +432,7 @@
         <w:rPr>
           <w:b w:val="0"/>
         </w:rPr>
-        <w:t>Imagine you organize a campus showcase. It opens at 17:00 and must finish by 18:00. At 16:40 a message says the projector may be about 25 minutes late. If you change too much, presenters and volunteers lose their time. If you wait too long, the demonstrations fail.</w:t>
+        <w:t>Meet Jordan, a volunteer organizer of a campus showcase (Jordan is an illustration, and the event is simulated). The doors open at 17:00 and the event must finish by 18:00. At 16:40, twenty minutes to doors open, a text says the projector may be about 25 minutes late. If Jordan changes too much, presenters and volunteers lose their time. If Jordan waits too long, the demonstrations fail.</w:t>
       </w:r>
     </w:p>
     <w:p>
@@ -510,7 +510,7 @@
       <w:r>
         <w:drawing>
           <wp:inline xmlns:a="http://schemas.openxmlformats.org/drawingml/2006/main" xmlns:pic="http://schemas.openxmlformats.org/drawingml/2006/picture">
-            <wp:extent cx="5943600" cy="1914717"/>
+            <wp:extent cx="5943600" cy="1763240"/>
             <wp:docPr id="2" name="Picture 2"/>
             <wp:cNvGraphicFramePr>
               <a:graphicFrameLocks noChangeAspect="1"/>
@@ -519,7 +519,7 @@
               <a:graphicData uri="http://schemas.openxmlformats.org/drawingml/2006/picture">
                 <pic:pic>
                   <pic:nvPicPr>
-                    <pic:cNvPr id="0" name="fig_timeline.png"/>
+                    <pic:cNvPr id="0" name="fig_contrast.png"/>
                     <pic:cNvPicPr/>
                   </pic:nvPicPr>
                   <pic:blipFill>
@@ -531,7 +531,7 @@
                   <pic:spPr>
                     <a:xfrm>
                       <a:off x="0" y="0"/>
-                      <a:ext cx="5943600" cy="1914717"/>
+                      <a:ext cx="5943600" cy="1763240"/>
                     </a:xfrm>
                     <a:prstGeom prst="rect"/>
                   </pic:spPr>
@@ -551,7 +551,7 @@
         <w:rPr>
           <w:b w:val="0"/>
         </w:rPr>
-        <w:t>Figure 2. The fictional campus showcase and the 16:40 message.</w:t>
+        <w:t>Figure 2. The same text, two ways. The top lane is an illustration of an agent with no gate, not one of the tested systems.</w:t>
       </w:r>
     </w:p>
     <w:p>
@@ -567,7 +567,7 @@
         <w:rPr>
           <w:b w:val="0"/>
         </w:rPr>
-        <w:t>Plan B combines known ideas in one bounded workflow. It does not claim to be the first of its kind. P0 to P3 are the four coordinator policies compared in section 7.</w:t>
+        <w:t>Plan B combines known ideas in one bounded workflow. It does not claim to be the first of its kind. The four coordinator policies are the ones compared in section 7.</w:t>
       </w:r>
     </w:p>
     <w:p>
@@ -584,7 +584,7 @@
         <w:rPr>
           <w:b w:val="0"/>
         </w:rPr>
-        <w:t xml:space="preserve"> let the model write tool calls directly. Plan B keeps that design as a comparison policy (P1), and in its own policy (P2) the model picks one option from a menu the server built and checked.</w:t>
+        <w:t xml:space="preserve"> let the model write tool calls directly. Plan B keeps that design as a comparison policy (the tool-calling model), and in its own policy (our coordinator) the model picks one option from a menu the server built and checked.</w:t>
       </w:r>
     </w:p>
     <w:p>
@@ -601,7 +601,7 @@
         <w:rPr>
           <w:b w:val="0"/>
         </w:rPr>
-        <w:t xml:space="preserve"> are predictable but read only the message forms they were written for. Plan B keeps a published rule policy (P0) as a baseline.</w:t>
+        <w:t xml:space="preserve"> are predictable but read only the message forms they were written for. Plan B keeps a published rule policy (the fixed rules) as a baseline.</w:t>
       </w:r>
     </w:p>
     <w:p>
@@ -1054,7 +1054,7 @@
       <w:r>
         <w:drawing>
           <wp:inline xmlns:a="http://schemas.openxmlformats.org/drawingml/2006/main" xmlns:pic="http://schemas.openxmlformats.org/drawingml/2006/picture">
-            <wp:extent cx="5943600" cy="2006258"/>
+            <wp:extent cx="5943600" cy="2005221"/>
             <wp:docPr id="3" name="Picture 3"/>
             <wp:cNvGraphicFramePr>
               <a:graphicFrameLocks noChangeAspect="1"/>
@@ -1075,7 +1075,7 @@
                   <pic:spPr>
                     <a:xfrm>
                       <a:off x="0" y="0"/>
-                      <a:ext cx="5943600" cy="2006258"/>
+                      <a:ext cx="5943600" cy="2005221"/>
                     </a:xfrm>
                     <a:prstGeom prst="rect"/>
                   </pic:spPr>
@@ -1159,7 +1159,7 @@
         <w:pStyle w:val="Heading2"/>
       </w:pPr>
       <w:r>
-        <w:t>4.1 The late projector (development case dev01)</w:t>
+        <w:t>4.1 The late projector (a development case)</w:t>
       </w:r>
     </w:p>
     <w:p>
@@ -1289,6 +1289,82 @@
       </w:r>
     </w:p>
     <w:p>
+      <w:r>
+        <w:rPr>
+          <w:b w:val="0"/>
+        </w:rPr>
+        <w:t>Figure 1 shows these steps and the program before and after the swap.</w:t>
+      </w:r>
+    </w:p>
+    <w:p>
+      <w:pPr>
+        <w:pStyle w:val="Heading2"/>
+      </w:pPr>
+      <w:r>
+        <w:t>4.2 Four messages, zero changes (a second development case)</w:t>
+      </w:r>
+    </w:p>
+    <w:p>
+      <w:pPr>
+        <w:pStyle w:val="ListNumber"/>
+        <w:numPr>
+          <w:ilvl w:val="0"/>
+          <w:numId w:val="11"/>
+        </w:numPr>
+      </w:pPr>
+      <w:r>
+        <w:rPr>
+          <w:b w:val="0"/>
+        </w:rPr>
+        <w:t>The same delay notice arrives, but the status check says on schedule, ETA 16:58. It is a false alarm, so the plan stays.</w:t>
+      </w:r>
+    </w:p>
+    <w:p>
+      <w:pPr>
+        <w:pStyle w:val="ListNumber"/>
+        <w:numPr>
+          <w:ilvl w:val="0"/>
+          <w:numId w:val="11"/>
+        </w:numPr>
+      </w:pPr>
+      <w:r>
+        <w:rPr>
+          <w:b w:val="0"/>
+        </w:rPr>
+        <w:t>At 16:44 a reminder says an order for the October 29 workshop was cancelled. That is another order on another date, so it does not apply.</w:t>
+      </w:r>
+    </w:p>
+    <w:p>
+      <w:pPr>
+        <w:pStyle w:val="ListNumber"/>
+        <w:numPr>
+          <w:ilvl w:val="0"/>
+          <w:numId w:val="11"/>
+        </w:numPr>
+      </w:pPr>
+      <w:r>
+        <w:rPr>
+          <w:b w:val="0"/>
+        </w:rPr>
+        <w:t>The reminder arrives again at 16:46, and a volunteer forwards it at 16:47. One source repeated is still one source, so it is a duplicate.</w:t>
+      </w:r>
+    </w:p>
+    <w:p>
+      <w:pPr>
+        <w:pStyle w:val="ListNumber"/>
+        <w:numPr>
+          <w:ilvl w:val="0"/>
+          <w:numId w:val="11"/>
+        </w:numPr>
+      </w:pPr>
+      <w:r>
+        <w:rPr>
+          <w:b w:val="0"/>
+        </w:rPr>
+        <w:t>Plan version 1 is kept: no hold, no spending, no change.</w:t>
+      </w:r>
+    </w:p>
+    <w:p>
       <w:pPr>
         <w:keepNext/>
         <w:jc w:val="center"/>
@@ -1296,7 +1372,7 @@
       <w:r>
         <w:drawing>
           <wp:inline xmlns:a="http://schemas.openxmlformats.org/drawingml/2006/main" xmlns:pic="http://schemas.openxmlformats.org/drawingml/2006/picture">
-            <wp:extent cx="5943600" cy="1914717"/>
+            <wp:extent cx="5943600" cy="2327313"/>
             <wp:docPr id="4" name="Picture 4"/>
             <wp:cNvGraphicFramePr>
               <a:graphicFrameLocks noChangeAspect="1"/>
@@ -1305,7 +1381,7 @@
               <a:graphicData uri="http://schemas.openxmlformats.org/drawingml/2006/picture">
                 <pic:pic>
                   <pic:nvPicPr>
-                    <pic:cNvPr id="0" name="fig_swap.png"/>
+                    <pic:cNvPr id="0" name="fig_quiet2.png"/>
                     <pic:cNvPicPr/>
                   </pic:nvPicPr>
                   <pic:blipFill>
@@ -1317,7 +1393,7 @@
                   <pic:spPr>
                     <a:xfrm>
                       <a:off x="0" y="0"/>
-                      <a:ext cx="5943600" cy="1914717"/>
+                      <a:ext cx="5943600" cy="2327313"/>
                     </a:xfrm>
                     <a:prstGeom prst="rect"/>
                   </pic:spPr>
@@ -1337,7 +1413,108 @@
         <w:rPr>
           <w:b w:val="0"/>
         </w:rPr>
-        <w:t>Figure 4. The free swap: the demonstrations move after the projector's ETA.</w:t>
+        <w:t>Figure 4. Four messages, zero changes: checks are selective, so only a fact that could change the decision is verified.</w:t>
+      </w:r>
+    </w:p>
+    <w:p>
+      <w:pPr>
+        <w:pStyle w:val="Heading2"/>
+      </w:pPr>
+      <w:r>
+        <w:t>4.3 Prepare, ask, commit (a third development case)</w:t>
+      </w:r>
+    </w:p>
+    <w:p>
+      <w:pPr>
+        <w:pStyle w:val="ListNumber"/>
+        <w:numPr>
+          <w:ilvl w:val="0"/>
+          <w:numId w:val="12"/>
+        </w:numPr>
+      </w:pPr>
+      <w:r>
+        <w:rPr>
+          <w:b w:val="0"/>
+        </w:rPr>
+        <w:t>The status check reports ETA 17:45, too late for either demonstration slot.</w:t>
+      </w:r>
+    </w:p>
+    <w:p>
+      <w:pPr>
+        <w:pStyle w:val="ListNumber"/>
+        <w:numPr>
+          <w:ilvl w:val="0"/>
+          <w:numId w:val="12"/>
+        </w:numPr>
+      </w:pPr>
+      <w:r>
+        <w:rPr>
+          <w:b w:val="0"/>
+        </w:rPr>
+        <w:t xml:space="preserve">The coordinator places a free </w:t>
+      </w:r>
+      <w:r>
+        <w:rPr>
+          <w:b/>
+        </w:rPr>
+        <w:t>hold</w:t>
+      </w:r>
+      <w:r>
+        <w:rPr>
+          <w:b w:val="0"/>
+        </w:rPr>
+        <w:t xml:space="preserve"> on the backup projector that expires at 16:55, and asks the organizer to raise the spending limit from $0 to $35.</w:t>
+      </w:r>
+    </w:p>
+    <w:p>
+      <w:pPr>
+        <w:pStyle w:val="ListNumber"/>
+        <w:numPr>
+          <w:ilvl w:val="0"/>
+          <w:numId w:val="12"/>
+        </w:numPr>
+      </w:pPr>
+      <w:r>
+        <w:rPr>
+          <w:b w:val="0"/>
+        </w:rPr>
+        <w:t>The organizer approves in a separate session. Only then is the backup committed, once, for $35.00.</w:t>
+      </w:r>
+    </w:p>
+    <w:p>
+      <w:pPr>
+        <w:pStyle w:val="Heading2"/>
+      </w:pPr>
+      <w:r>
+        <w:t>4.4 Which policy acted</w:t>
+      </w:r>
+    </w:p>
+    <w:p>
+      <w:r>
+        <w:rPr>
+          <w:b w:val="0"/>
+        </w:rPr>
+        <w:t xml:space="preserve">The frames above come from an automated browser run of the rule baseline (the fixed rules), with no model call. In a recorded development run, our coordinator (the AI policy) made the same status check and the same swap at 16:43 with receipt </w:t>
+      </w:r>
+      <w:r>
+        <w:rPr>
+          <w:rStyle w:val="InlineCode"/>
+        </w:rPr>
+        <w:t>rcpt_0001</w:t>
+      </w:r>
+      <w:r>
+        <w:rPr>
+          <w:b w:val="0"/>
+        </w:rPr>
+        <w:t>, in 3 model calls for $0.0366.</w:t>
+      </w:r>
+    </w:p>
+    <w:p>
+      <w:pPr>
+        <w:pStyle w:val="Heading1"/>
+      </w:pPr>
+      <w:r>
+        <w:t>5. Architecture</w:t>
       </w:r>
     </w:p>
     <w:p>
@@ -1348,7 +1525,7 @@
       <w:r>
         <w:drawing>
           <wp:inline xmlns:a="http://schemas.openxmlformats.org/drawingml/2006/main" xmlns:pic="http://schemas.openxmlformats.org/drawingml/2006/picture">
-            <wp:extent cx="5120640" cy="3224107"/>
+            <wp:extent cx="5943600" cy="2914598"/>
             <wp:docPr id="5" name="Picture 5"/>
             <wp:cNvGraphicFramePr>
               <a:graphicFrameLocks noChangeAspect="1"/>
@@ -1357,7 +1534,7 @@
               <a:graphicData uri="http://schemas.openxmlformats.org/drawingml/2006/picture">
                 <pic:pic>
                   <pic:nvPicPr>
-                    <pic:cNvPr id="0" name="before_after.png"/>
+                    <pic:cNvPr id="0" name="fig_design.png"/>
                     <pic:cNvPicPr/>
                   </pic:nvPicPr>
                   <pic:blipFill>
@@ -1369,7 +1546,7 @@
                   <pic:spPr>
                     <a:xfrm>
                       <a:off x="0" y="0"/>
-                      <a:ext cx="5120640" cy="3224107"/>
+                      <a:ext cx="5943600" cy="2914598"/>
                     </a:xfrm>
                     <a:prstGeom prst="rect"/>
                   </pic:spPr>
@@ -1389,280 +1566,7 @@
         <w:rPr>
           <w:b w:val="0"/>
         </w:rPr>
-        <w:t>Figure 5. The app's before and after view with the receipt (automated run).</w:t>
-      </w:r>
-    </w:p>
-    <w:p>
-      <w:pPr>
-        <w:pStyle w:val="Heading2"/>
-      </w:pPr>
-      <w:r>
-        <w:t>4.2 Four messages, zero changes (development case dev04)</w:t>
-      </w:r>
-    </w:p>
-    <w:p>
-      <w:pPr>
-        <w:pStyle w:val="ListNumber"/>
-        <w:numPr>
-          <w:ilvl w:val="0"/>
-          <w:numId w:val="11"/>
-        </w:numPr>
-      </w:pPr>
-      <w:r>
-        <w:rPr>
-          <w:b w:val="0"/>
-        </w:rPr>
-        <w:t>The same delay notice arrives, but the status check says on schedule, ETA 16:58. It is a false alarm, so the plan stays.</w:t>
-      </w:r>
-    </w:p>
-    <w:p>
-      <w:pPr>
-        <w:pStyle w:val="ListNumber"/>
-        <w:numPr>
-          <w:ilvl w:val="0"/>
-          <w:numId w:val="11"/>
-        </w:numPr>
-      </w:pPr>
-      <w:r>
-        <w:rPr>
-          <w:b w:val="0"/>
-        </w:rPr>
-        <w:t>At 16:44 a reminder says order P09 for the October 29 workshop was cancelled. That is another order on another date, so it does not apply.</w:t>
-      </w:r>
-    </w:p>
-    <w:p>
-      <w:pPr>
-        <w:pStyle w:val="ListNumber"/>
-        <w:numPr>
-          <w:ilvl w:val="0"/>
-          <w:numId w:val="11"/>
-        </w:numPr>
-      </w:pPr>
-      <w:r>
-        <w:rPr>
-          <w:b w:val="0"/>
-        </w:rPr>
-        <w:t>The reminder arrives again at 16:46, and a volunteer forwards it at 16:47. One source repeated is still one source, so it is a duplicate.</w:t>
-      </w:r>
-    </w:p>
-    <w:p>
-      <w:pPr>
-        <w:pStyle w:val="ListNumber"/>
-        <w:numPr>
-          <w:ilvl w:val="0"/>
-          <w:numId w:val="11"/>
-        </w:numPr>
-      </w:pPr>
-      <w:r>
-        <w:rPr>
-          <w:b w:val="0"/>
-        </w:rPr>
-        <w:t>Plan version 1 is kept: no hold, no spending, no change.</w:t>
-      </w:r>
-    </w:p>
-    <w:p>
-      <w:pPr>
-        <w:keepNext/>
-        <w:jc w:val="center"/>
-      </w:pPr>
-      <w:r>
-        <w:drawing>
-          <wp:inline xmlns:a="http://schemas.openxmlformats.org/drawingml/2006/main" xmlns:pic="http://schemas.openxmlformats.org/drawingml/2006/picture">
-            <wp:extent cx="5943600" cy="2159556"/>
-            <wp:docPr id="6" name="Picture 6"/>
-            <wp:cNvGraphicFramePr>
-              <a:graphicFrameLocks noChangeAspect="1"/>
-            </wp:cNvGraphicFramePr>
-            <a:graphic>
-              <a:graphicData uri="http://schemas.openxmlformats.org/drawingml/2006/picture">
-                <pic:pic>
-                  <pic:nvPicPr>
-                    <pic:cNvPr id="0" name="fig_quiet.png"/>
-                    <pic:cNvPicPr/>
-                  </pic:nvPicPr>
-                  <pic:blipFill>
-                    <a:blip r:embed="rId16"/>
-                    <a:stretch>
-                      <a:fillRect/>
-                    </a:stretch>
-                  </pic:blipFill>
-                  <pic:spPr>
-                    <a:xfrm>
-                      <a:off x="0" y="0"/>
-                      <a:ext cx="5943600" cy="2159556"/>
-                    </a:xfrm>
-                    <a:prstGeom prst="rect"/>
-                  </pic:spPr>
-                </pic:pic>
-              </a:graphicData>
-            </a:graphic>
-          </wp:inline>
-        </w:drawing>
-      </w:r>
-    </w:p>
-    <w:p>
-      <w:pPr>
-        <w:pStyle w:val="Caption"/>
-        <w:jc w:val="center"/>
-      </w:pPr>
-      <w:r>
-        <w:rPr>
-          <w:b w:val="0"/>
-        </w:rPr>
-        <w:t>Figure 6. Four messages, zero changes.</w:t>
-      </w:r>
-    </w:p>
-    <w:p>
-      <w:pPr>
-        <w:pStyle w:val="Heading2"/>
-      </w:pPr>
-      <w:r>
-        <w:t>4.3 Prepare, ask, commit (development case dev02)</w:t>
-      </w:r>
-    </w:p>
-    <w:p>
-      <w:pPr>
-        <w:pStyle w:val="ListNumber"/>
-        <w:numPr>
-          <w:ilvl w:val="0"/>
-          <w:numId w:val="12"/>
-        </w:numPr>
-      </w:pPr>
-      <w:r>
-        <w:rPr>
-          <w:b w:val="0"/>
-        </w:rPr>
-        <w:t>The status check reports ETA 17:45, too late for either demonstration slot.</w:t>
-      </w:r>
-    </w:p>
-    <w:p>
-      <w:pPr>
-        <w:pStyle w:val="ListNumber"/>
-        <w:numPr>
-          <w:ilvl w:val="0"/>
-          <w:numId w:val="12"/>
-        </w:numPr>
-      </w:pPr>
-      <w:r>
-        <w:rPr>
-          <w:b w:val="0"/>
-        </w:rPr>
-        <w:t xml:space="preserve">The coordinator places a free </w:t>
-      </w:r>
-      <w:r>
-        <w:rPr>
-          <w:b/>
-        </w:rPr>
-        <w:t>hold</w:t>
-      </w:r>
-      <w:r>
-        <w:rPr>
-          <w:b w:val="0"/>
-        </w:rPr>
-        <w:t xml:space="preserve"> on the backup projector that expires at 16:55, and asks the organizer to raise the spending limit from $0 to $35.</w:t>
-      </w:r>
-    </w:p>
-    <w:p>
-      <w:pPr>
-        <w:pStyle w:val="ListNumber"/>
-        <w:numPr>
-          <w:ilvl w:val="0"/>
-          <w:numId w:val="12"/>
-        </w:numPr>
-      </w:pPr>
-      <w:r>
-        <w:rPr>
-          <w:b w:val="0"/>
-        </w:rPr>
-        <w:t>The organizer approves in a separate session. Only then is the backup committed, once, for $35.00.</w:t>
-      </w:r>
-    </w:p>
-    <w:p>
-      <w:pPr>
-        <w:pStyle w:val="Heading2"/>
-      </w:pPr>
-      <w:r>
-        <w:t>4.4 Which policy acted</w:t>
-      </w:r>
-    </w:p>
-    <w:p>
-      <w:r>
-        <w:rPr>
-          <w:b w:val="0"/>
-        </w:rPr>
-        <w:t xml:space="preserve">The frames above come from an automated browser run of the rule baseline (P0), with no model call. In a recorded development run, the AI coordinator (P2) made the same status check and the same swap at 16:43 with receipt </w:t>
-      </w:r>
-      <w:r>
-        <w:rPr>
-          <w:rStyle w:val="InlineCode"/>
-        </w:rPr>
-        <w:t>rcpt_0001</w:t>
-      </w:r>
-      <w:r>
-        <w:rPr>
-          <w:b w:val="0"/>
-        </w:rPr>
-        <w:t>, in 3 model calls for $0.0366.</w:t>
-      </w:r>
-    </w:p>
-    <w:p>
-      <w:pPr>
-        <w:pStyle w:val="Heading1"/>
-      </w:pPr>
-      <w:r>
-        <w:t>5. Architecture</w:t>
-      </w:r>
-    </w:p>
-    <w:p>
-      <w:pPr>
-        <w:keepNext/>
-        <w:jc w:val="center"/>
-      </w:pPr>
-      <w:r>
-        <w:drawing>
-          <wp:inline xmlns:a="http://schemas.openxmlformats.org/drawingml/2006/main" xmlns:pic="http://schemas.openxmlformats.org/drawingml/2006/picture">
-            <wp:extent cx="5943600" cy="2850754"/>
-            <wp:docPr id="7" name="Picture 7"/>
-            <wp:cNvGraphicFramePr>
-              <a:graphicFrameLocks noChangeAspect="1"/>
-            </wp:cNvGraphicFramePr>
-            <a:graphic>
-              <a:graphicData uri="http://schemas.openxmlformats.org/drawingml/2006/picture">
-                <pic:pic>
-                  <pic:nvPicPr>
-                    <pic:cNvPr id="0" name="fig_architecture.png"/>
-                    <pic:cNvPicPr/>
-                  </pic:nvPicPr>
-                  <pic:blipFill>
-                    <a:blip r:embed="rId17"/>
-                    <a:stretch>
-                      <a:fillRect/>
-                    </a:stretch>
-                  </pic:blipFill>
-                  <pic:spPr>
-                    <a:xfrm>
-                      <a:off x="0" y="0"/>
-                      <a:ext cx="5943600" cy="2850754"/>
-                    </a:xfrm>
-                    <a:prstGeom prst="rect"/>
-                  </pic:spPr>
-                </pic:pic>
-              </a:graphicData>
-            </a:graphic>
-          </wp:inline>
-        </w:drawing>
-      </w:r>
-    </w:p>
-    <w:p>
-      <w:pPr>
-        <w:pStyle w:val="Caption"/>
-        <w:jc w:val="center"/>
-      </w:pPr>
-      <w:r>
-        <w:rPr>
-          <w:b w:val="0"/>
-        </w:rPr>
-        <w:t>Figure 7. Four policies, one executor at the authority boundary.</w:t>
+        <w:t>Figure 5. The model only picks among options the server built and checked, and one gate writes every receipt. Solid: connected today. Dashed: designed, not connected.</w:t>
       </w:r>
     </w:p>
     <w:p>
@@ -2139,7 +2043,7 @@
                 <w:b w:val="0"/>
                 <w:sz w:val="19"/>
               </w:rPr>
-              <w:t>Rule policies (P0)</w:t>
+              <w:t>Rule policies (the fixed rules)</w:t>
             </w:r>
           </w:p>
         </w:tc>
@@ -2195,7 +2099,7 @@
                 <w:b w:val="0"/>
                 <w:sz w:val="19"/>
               </w:rPr>
-              <w:t>Model policies (P1 to P3)</w:t>
+              <w:t>Model policies (the three model approaches)</w:t>
             </w:r>
           </w:p>
         </w:tc>
@@ -2441,8 +2345,8 @@
       <w:r>
         <w:drawing>
           <wp:inline xmlns:a="http://schemas.openxmlformats.org/drawingml/2006/main" xmlns:pic="http://schemas.openxmlformats.org/drawingml/2006/picture">
-            <wp:extent cx="5943600" cy="2614323"/>
-            <wp:docPr id="8" name="Picture 8"/>
+            <wp:extent cx="5943600" cy="2614150"/>
+            <wp:docPr id="6" name="Picture 6"/>
             <wp:cNvGraphicFramePr>
               <a:graphicFrameLocks noChangeAspect="1"/>
             </wp:cNvGraphicFramePr>
@@ -2454,7 +2358,7 @@
                     <pic:cNvPicPr/>
                   </pic:nvPicPr>
                   <pic:blipFill>
-                    <a:blip r:embed="rId18"/>
+                    <a:blip r:embed="rId16"/>
                     <a:stretch>
                       <a:fillRect/>
                     </a:stretch>
@@ -2462,7 +2366,7 @@
                   <pic:spPr>
                     <a:xfrm>
                       <a:off x="0" y="0"/>
-                      <a:ext cx="5943600" cy="2614323"/>
+                      <a:ext cx="5943600" cy="2614150"/>
                     </a:xfrm>
                     <a:prstGeom prst="rect"/>
                   </pic:spPr>
@@ -2482,7 +2386,7 @@
         <w:rPr>
           <w:b w:val="0"/>
         </w:rPr>
-        <w:t>Figure 8. Verify, prepare, commit, keep, with this event's examples.</w:t>
+        <w:t>Figure 6. Verify, prepare, commit, keep, with this event's examples.</w:t>
       </w:r>
     </w:p>
     <w:p>
@@ -2490,7 +2394,7 @@
         <w:rPr>
           <w:b w:val="0"/>
         </w:rPr>
-        <w:t>The selective policy P2 follows these steps each time the runner wakes it, that is, gives it a turn because the shared state changed or a wait it set has passed:</w:t>
+        <w:t>The selective policy our coordinator follows these steps each time the runner wakes it, that is, gives it a turn because the shared state changed or a wait it set has passed:</w:t>
       </w:r>
     </w:p>
     <w:p>
@@ -2678,7 +2582,7 @@
                 <w:b/>
                 <w:sz w:val="19"/>
               </w:rPr>
-              <w:t>Frozen id</w:t>
+              <w:t>Frozen ids: earlier test, then final system</w:t>
             </w:r>
           </w:p>
         </w:tc>
@@ -2718,7 +2622,7 @@
                 <w:b w:val="0"/>
                 <w:sz w:val="19"/>
               </w:rPr>
-              <w:t>P0 rules</w:t>
+              <w:t>Fixed rules (baseline)</w:t>
             </w:r>
           </w:p>
         </w:tc>
@@ -2750,6 +2654,13 @@
                 <w:sz w:val="19"/>
               </w:rPr>
               <w:t>pantry-rules/1.1.0</w:t>
+            </w:r>
+            <w:r>
+              <w:rPr>
+                <w:b w:val="0"/>
+                <w:sz w:val="19"/>
+              </w:rPr>
+              <w:t>, unchanged</w:t>
             </w:r>
           </w:p>
         </w:tc>
@@ -2788,7 +2699,7 @@
                 <w:b w:val="0"/>
                 <w:sz w:val="19"/>
               </w:rPr>
-              <w:t>P1 tool use</w:t>
+              <w:t>Tool-calling model</w:t>
             </w:r>
           </w:p>
         </w:tc>
@@ -2826,7 +2737,14 @@
                 <w:b w:val="0"/>
                 <w:sz w:val="19"/>
               </w:rPr>
-              <w:t>)</w:t>
+              <w:t xml:space="preserve">), then </w:t>
+            </w:r>
+            <w:r>
+              <w:rPr>
+                <w:rStyle w:val="InlineCode"/>
+                <w:sz w:val="19"/>
+              </w:rPr>
+              <w:t>tool-use/1.2.0</w:t>
             </w:r>
           </w:p>
         </w:tc>
@@ -2865,7 +2783,7 @@
                 <w:b w:val="0"/>
                 <w:sz w:val="19"/>
               </w:rPr>
-              <w:t>P2 selective (mine)</w:t>
+              <w:t>Our coordinator (my design)</w:t>
             </w:r>
           </w:p>
         </w:tc>
@@ -2883,6 +2801,20 @@
                 <w:sz w:val="19"/>
               </w:rPr>
               <w:t>live/1.1.0</w:t>
+            </w:r>
+            <w:r>
+              <w:rPr>
+                <w:b w:val="0"/>
+                <w:sz w:val="19"/>
+              </w:rPr>
+              <w:t xml:space="preserve">, then </w:t>
+            </w:r>
+            <w:r>
+              <w:rPr>
+                <w:rStyle w:val="InlineCode"/>
+                <w:sz w:val="19"/>
+              </w:rPr>
+              <w:t>live/1.2.0</w:t>
             </w:r>
           </w:p>
         </w:tc>
@@ -2921,7 +2853,7 @@
                 <w:b w:val="0"/>
                 <w:sz w:val="19"/>
               </w:rPr>
-              <w:t>P3 verify all</w:t>
+              <w:t>Check-all variant</w:t>
             </w:r>
           </w:p>
         </w:tc>
@@ -2940,6 +2872,20 @@
               </w:rPr>
               <w:t>verify-all/1.1.0</w:t>
             </w:r>
+            <w:r>
+              <w:rPr>
+                <w:b w:val="0"/>
+                <w:sz w:val="19"/>
+              </w:rPr>
+              <w:t xml:space="preserve">, then </w:t>
+            </w:r>
+            <w:r>
+              <w:rPr>
+                <w:rStyle w:val="InlineCode"/>
+                <w:sz w:val="19"/>
+              </w:rPr>
+              <w:t>verify-all/1.2.0</w:t>
+            </w:r>
           </w:p>
         </w:tc>
         <w:tc>
@@ -2955,7 +2901,7 @@
                 <w:b w:val="0"/>
                 <w:sz w:val="19"/>
               </w:rPr>
-              <w:t xml:space="preserve">P2, with every relevant status check run first by the server under rule </w:t>
+              <w:t xml:space="preserve">Our coordinator, with every relevant status check run first by the server under rule </w:t>
             </w:r>
             <w:r>
               <w:rPr>
@@ -2995,7 +2941,7 @@
         <w:rPr>
           <w:b w:val="0"/>
         </w:rPr>
-        <w:t xml:space="preserve"> through OpenRouter, the same configuration for P1 to P3, 4096 output tokens per call, strict JSON output.</w:t>
+        <w:t xml:space="preserve"> through OpenRouter, the same configuration for the three model approaches, 4096 output tokens per call, strict JSON output.</w:t>
       </w:r>
     </w:p>
     <w:p>
@@ -3040,13 +2986,13 @@
         <w:rPr>
           <w:b/>
         </w:rPr>
-        <w:t>P1 is a serious baseline.</w:t>
+        <w:t>The tool-calling model is a serious baseline.</w:t>
       </w:r>
       <w:r>
         <w:rPr>
           <w:b w:val="0"/>
         </w:rPr>
-        <w:t xml:space="preserve"> It sees the objective, the budget, the tools and the candidates, and may verify and hold like P2.</w:t>
+        <w:t xml:space="preserve"> It sees the objective, the budget, the tools and the candidates, and may verify and hold like our coordinator.</w:t>
       </w:r>
     </w:p>
     <w:p>
@@ -3057,7 +3003,7 @@
         <w:rPr>
           <w:b/>
         </w:rPr>
-        <w:t>P3 is an ablation.</w:t>
+        <w:t>The check-all variant is an ablation.</w:t>
       </w:r>
       <w:r>
         <w:rPr>
@@ -3127,7 +3073,7 @@
         <w:drawing>
           <wp:inline xmlns:a="http://schemas.openxmlformats.org/drawingml/2006/main" xmlns:pic="http://schemas.openxmlformats.org/drawingml/2006/picture">
             <wp:extent cx="4572000" cy="3700431"/>
-            <wp:docPr id="9" name="Picture 9"/>
+            <wp:docPr id="7" name="Picture 7"/>
             <wp:cNvGraphicFramePr>
               <a:graphicFrameLocks noChangeAspect="1"/>
             </wp:cNvGraphicFramePr>
@@ -3139,7 +3085,7 @@
                     <pic:cNvPicPr/>
                   </pic:nvPicPr>
                   <pic:blipFill>
-                    <a:blip r:embed="rId19"/>
+                    <a:blip r:embed="rId17"/>
                     <a:stretch>
                       <a:fillRect/>
                     </a:stretch>
@@ -3167,7 +3113,7 @@
         <w:rPr>
           <w:b w:val="0"/>
         </w:rPr>
-        <w:t>Figure 9. Development case skills_dev01: the peer lead's own check-in moves two activities (automated run).</w:t>
+        <w:t>Figure 7. A real screenshot of the app, in a development case of the skills exchange: the peer lead's own check-in moves two activities (automated run).</w:t>
       </w:r>
     </w:p>
     <w:p>
@@ -3290,8 +3236,8 @@
       <w:r>
         <w:drawing>
           <wp:inline xmlns:a="http://schemas.openxmlformats.org/drawingml/2006/main" xmlns:pic="http://schemas.openxmlformats.org/drawingml/2006/picture">
-            <wp:extent cx="5943600" cy="2514408"/>
-            <wp:docPr id="10" name="Picture 10"/>
+            <wp:extent cx="5943600" cy="2935535"/>
+            <wp:docPr id="8" name="Picture 8"/>
             <wp:cNvGraphicFramePr>
               <a:graphicFrameLocks noChangeAspect="1"/>
             </wp:cNvGraphicFramePr>
@@ -3299,11 +3245,11 @@
               <a:graphicData uri="http://schemas.openxmlformats.org/drawingml/2006/picture">
                 <pic:pic>
                   <pic:nvPicPr>
-                    <pic:cNvPr id="0" name="fig_pantry.png"/>
+                    <pic:cNvPr id="0" name="fig_pantry_chart.png"/>
                     <pic:cNvPicPr/>
                   </pic:nvPicPr>
                   <pic:blipFill>
-                    <a:blip r:embed="rId20"/>
+                    <a:blip r:embed="rId18"/>
                     <a:stretch>
                       <a:fillRect/>
                     </a:stretch>
@@ -3311,7 +3257,7 @@
                   <pic:spPr>
                     <a:xfrm>
                       <a:off x="0" y="0"/>
-                      <a:ext cx="5943600" cy="2514408"/>
+                      <a:ext cx="5943600" cy="2935535"/>
                     </a:xfrm>
                     <a:prstGeom prst="rect"/>
                   </pic:spPr>
@@ -3331,7 +3277,7 @@
         <w:rPr>
           <w:b w:val="0"/>
         </w:rPr>
-        <w:t>Figure 10. Stock and the two counters at four moments (development case pantry_dev01).</w:t>
+        <w:t>Figure 8. Kits at four moments of a development case, with the 40-kit target. The 20 late kits never count as stock.</w:t>
       </w:r>
     </w:p>
     <w:p>
@@ -3339,7 +3285,7 @@
         <w:rPr>
           <w:b w:val="0"/>
         </w:rPr>
-        <w:t>In development case pantry_dev02, staff hand off only 10 of the 16 kits. 34 kits are distributed, a 6-kit deficit is reported, and the target stays 40.</w:t>
+        <w:t>In a second pantry development case, staff hand off only 10 of the 16 kits. 34 kits are distributed, a 6-kit deficit is reported, and the target stays 40.</w:t>
       </w:r>
     </w:p>
     <w:p>
@@ -3626,8 +3572,8 @@
       <w:r>
         <w:drawing>
           <wp:inline xmlns:a="http://schemas.openxmlformats.org/drawingml/2006/main" xmlns:pic="http://schemas.openxmlformats.org/drawingml/2006/picture">
-            <wp:extent cx="5943600" cy="857115"/>
-            <wp:docPr id="11" name="Picture 11"/>
+            <wp:extent cx="5943600" cy="852655"/>
+            <wp:docPr id="9" name="Picture 9"/>
             <wp:cNvGraphicFramePr>
               <a:graphicFrameLocks noChangeAspect="1"/>
             </wp:cNvGraphicFramePr>
@@ -3639,7 +3585,7 @@
                     <pic:cNvPicPr/>
                   </pic:nvPicPr>
                   <pic:blipFill>
-                    <a:blip r:embed="rId21"/>
+                    <a:blip r:embed="rId19"/>
                     <a:stretch>
                       <a:fillRect/>
                     </a:stretch>
@@ -3647,7 +3593,7 @@
                   <pic:spPr>
                     <a:xfrm>
                       <a:off x="0" y="0"/>
-                      <a:ext cx="5943600" cy="857115"/>
+                      <a:ext cx="5943600" cy="852655"/>
                     </a:xfrm>
                     <a:prstGeom prst="rect"/>
                   </pic:spPr>
@@ -3667,7 +3613,7 @@
         <w:rPr>
           <w:b w:val="0"/>
         </w:rPr>
-        <w:t>Figure 11. Practice, freeze, then one held-out test.</w:t>
+        <w:t>Figure 9. Practice, freeze, then one held-out test.</w:t>
       </w:r>
     </w:p>
     <w:tbl>
@@ -4431,7 +4377,7 @@
         <w:rPr>
           <w:b w:val="0"/>
         </w:rPr>
-        <w:t>: 80 campus runs (8 cases, P0 once, P1 to P3 three times each) and, separately, 40 pantry runs. The two suites are never pooled.</w:t>
+        <w:t>: 80 campus runs (8 cases, the fixed rules once, the three model approaches three times each) and, separately, 40 pantry runs. The two suites are never pooled.</w:t>
       </w:r>
     </w:p>
     <w:p>
@@ -4525,59 +4471,15 @@
     <w:p>
       <w:r>
         <w:rPr>
+          <w:b/>
+        </w:rPr>
+        <w:t>The final system.</w:t>
+      </w:r>
+      <w:r>
+        <w:rPr>
           <w:b w:val="0"/>
         </w:rPr>
-        <w:t xml:space="preserve">The reported run of the frozen comparison on the locked held-out cases is </w:t>
-      </w:r>
-      <w:r>
-        <w:rPr>
-          <w:rStyle w:val="InlineCode"/>
-        </w:rPr>
-        <w:t>wave3_heldout_20261025T1625Z</w:t>
-      </w:r>
-      <w:r>
-        <w:rPr>
-          <w:b w:val="0"/>
-        </w:rPr>
-        <w:t xml:space="preserve">, committed in c052338 under </w:t>
-      </w:r>
-      <w:r>
-        <w:rPr>
-          <w:rStyle w:val="InlineCode"/>
-        </w:rPr>
-        <w:t>apps/plan_b/evaluation/results/wave3_heldout_20261025T1625Z/</w:t>
-      </w:r>
-      <w:r>
-        <w:rPr>
-          <w:b w:val="0"/>
-        </w:rPr>
-        <w:t>. All 80 planned campus runs and all 40 planned pantry runs were recorded, with none missing, aborted, timed out or crashed. These are descriptive counts from one reported run on 8 campus and 4 pantry cases. The case is the unit, the three runs of a case are repeated trials, and no significance test is made. The two suites are separate. Section 12.7 adds version 1.2 (Wave 3b): a fresh held-out check on six new cases and a post-hoc diagnostic rerun on these spent cases. Neither replaces this run.</w:t>
-      </w:r>
-    </w:p>
-    <w:p>
-      <w:r>
-        <w:rPr>
-          <w:b/>
-        </w:rPr>
-        <w:t>Headline.</w:t>
-      </w:r>
-      <w:r>
-        <w:rPr>
-          <w:b w:val="0"/>
-        </w:rPr>
-        <w:t xml:space="preserve"> No policy executed a violation, and no policy committed a change on the three quiet cases. </w:t>
-      </w:r>
-      <w:r>
-        <w:rPr>
-          <w:b/>
-        </w:rPr>
-        <w:t>P2, my policy, shows no consistent advantage over P1 or P0 here.</w:t>
-      </w:r>
-      <w:r>
-        <w:rPr>
-          <w:b w:val="0"/>
-        </w:rPr>
-        <w:t xml:space="preserve"> On one reported run of 8 campus and 4 pantry held-out cases, P2 met every run of 6 of 8 campus cases (P1 met every run of 8, P3 of 7, P0 of 6) and of 3 of 4 pantry cases (P0 of 4, P1 of 2, P3 of 2). Its misses come from a frozen attention rule that passes only equipment notices to the planner (C06), choices that used up the 8-call limit (C07) and an unavailable pool kept as a handoff option (T03). A first attempt was voided, as section 12.5 explains.</w:t>
+        <w:t xml:space="preserve"> On the six new cases of the final freeze, 59 of 60 runs met the expected outcome (Figure 10). All three model-based approaches met every run, and the only miss was the fixed rules on a case where a volunteer runs late, because a person's own delay is a message its rules cannot read. No executed action broke a rule, because every change of every approach passes the same gate. Six cases cannot rank the approaches, so the result is about safety and reliability, not a winner. Section 12.7 gives these numbers in full.</w:t>
       </w:r>
     </w:p>
     <w:p>
@@ -4588,8 +4490,8 @@
       <w:r>
         <w:drawing>
           <wp:inline xmlns:a="http://schemas.openxmlformats.org/drawingml/2006/main" xmlns:pic="http://schemas.openxmlformats.org/drawingml/2006/picture">
-            <wp:extent cx="5943600" cy="1820698"/>
-            <wp:docPr id="12" name="Picture 12"/>
+            <wp:extent cx="5943600" cy="2136235"/>
+            <wp:docPr id="10" name="Picture 10"/>
             <wp:cNvGraphicFramePr>
               <a:graphicFrameLocks noChangeAspect="1"/>
             </wp:cNvGraphicFramePr>
@@ -4597,11 +4499,11 @@
               <a:graphicData uri="http://schemas.openxmlformats.org/drawingml/2006/picture">
                 <pic:pic>
                   <pic:nvPicPr>
-                    <pic:cNvPr id="0" name="fig_results.png"/>
+                    <pic:cNvPr id="0" name="fig_result.png"/>
                     <pic:cNvPicPr/>
                   </pic:nvPicPr>
                   <pic:blipFill>
-                    <a:blip r:embed="rId22"/>
+                    <a:blip r:embed="rId20"/>
                     <a:stretch>
                       <a:fillRect/>
                     </a:stretch>
@@ -4609,7 +4511,7 @@
                   <pic:spPr>
                     <a:xfrm>
                       <a:off x="0" y="0"/>
-                      <a:ext cx="5943600" cy="1820698"/>
+                      <a:ext cx="5943600" cy="2136235"/>
                     </a:xfrm>
                     <a:prstGeom prst="rect"/>
                   </pic:spPr>
@@ -4629,7 +4531,131 @@
         <w:rPr>
           <w:b w:val="0"/>
         </w:rPr>
-        <w:t>Figure 12. Held-out runs that met the case's outcome, per policy and suite.</w:t>
+        <w:t>Figure 10. The final system on six new cases: runs that met the expected outcome, per approach and suite.</w:t>
+      </w:r>
+    </w:p>
+    <w:p>
+      <w:r>
+        <w:rPr>
+          <w:b/>
+        </w:rPr>
+        <w:t>The complete record.</w:t>
+      </w:r>
+      <w:r>
+        <w:rPr>
+          <w:b w:val="0"/>
+        </w:rPr>
+        <w:t xml:space="preserve"> Sections 12.1 to 12.6 report the earlier locked test of the previous policies on twelve cases. It is how the defects fixed before the final freeze were found, and its cases are now development cases. Section 12.7 reports the final system and a diagnostic rerun on those spent cases, which is never a held-out result.</w:t>
+      </w:r>
+    </w:p>
+    <w:p>
+      <w:r>
+        <w:rPr>
+          <w:b w:val="0"/>
+        </w:rPr>
+        <w:t xml:space="preserve">The reported run of the frozen comparison on the twelve cases of the earlier locked test (now development cases) is </w:t>
+      </w:r>
+      <w:r>
+        <w:rPr>
+          <w:rStyle w:val="InlineCode"/>
+        </w:rPr>
+        <w:t>wave3_heldout_20261025T1625Z</w:t>
+      </w:r>
+      <w:r>
+        <w:rPr>
+          <w:b w:val="0"/>
+        </w:rPr>
+        <w:t xml:space="preserve">, committed in c052338 under </w:t>
+      </w:r>
+      <w:r>
+        <w:rPr>
+          <w:rStyle w:val="InlineCode"/>
+        </w:rPr>
+        <w:t>apps/plan_b/evaluation/results/wave3_heldout_20261025T1625Z/</w:t>
+      </w:r>
+      <w:r>
+        <w:rPr>
+          <w:b w:val="0"/>
+        </w:rPr>
+        <w:t>. All 80 planned campus runs and all 40 planned pantry runs were recorded, with none missing, aborted, timed out or crashed. These are descriptive counts from one reported run on 8 campus and 4 pantry cases. The case is the unit, the three runs of a case are repeated trials, and no significance test is made. The two suites are separate. Section 12.7 adds version 1.2 (Wave 3b): a fresh held-out check on six new cases and a post-hoc diagnostic rerun on these spent cases. Neither replaces this run.</w:t>
+      </w:r>
+    </w:p>
+    <w:p>
+      <w:r>
+        <w:rPr>
+          <w:b/>
+        </w:rPr>
+        <w:t>Headline.</w:t>
+      </w:r>
+      <w:r>
+        <w:rPr>
+          <w:b w:val="0"/>
+        </w:rPr>
+        <w:t xml:space="preserve"> No policy executed a violation, and no policy committed a change on the three quiet cases. </w:t>
+      </w:r>
+      <w:r>
+        <w:rPr>
+          <w:b/>
+        </w:rPr>
+        <w:t>Our coordinator, my policy, shows no consistent advantage over the tool-calling model or the fixed rules here.</w:t>
+      </w:r>
+      <w:r>
+        <w:rPr>
+          <w:b w:val="0"/>
+        </w:rPr>
+        <w:t xml:space="preserve"> On one reported run of 8 campus and 4 pantry held-out cases, our coordinator met every run of 6 of 8 campus cases (the tool-calling model met every run of 8, the check-all variant of 7, the fixed rules of 6) and of 3 of 4 pantry cases (the fixed rules of 4, the tool-calling model of 2, the check-all variant of 2). Its misses come from a frozen attention rule that passes only equipment notices to the planner (C06), choices that used up the 8-call limit (C07) and an unavailable pool kept as a handoff option (T03). A first attempt was voided, as section 12.5 explains.</w:t>
+      </w:r>
+    </w:p>
+    <w:p>
+      <w:pPr>
+        <w:keepNext/>
+        <w:jc w:val="center"/>
+      </w:pPr>
+      <w:r>
+        <w:drawing>
+          <wp:inline xmlns:a="http://schemas.openxmlformats.org/drawingml/2006/main" xmlns:pic="http://schemas.openxmlformats.org/drawingml/2006/picture">
+            <wp:extent cx="5943600" cy="2140129"/>
+            <wp:docPr id="11" name="Picture 11"/>
+            <wp:cNvGraphicFramePr>
+              <a:graphicFrameLocks noChangeAspect="1"/>
+            </wp:cNvGraphicFramePr>
+            <a:graphic>
+              <a:graphicData uri="http://schemas.openxmlformats.org/drawingml/2006/picture">
+                <pic:pic>
+                  <pic:nvPicPr>
+                    <pic:cNvPr id="0" name="fig_result_record.png"/>
+                    <pic:cNvPicPr/>
+                  </pic:nvPicPr>
+                  <pic:blipFill>
+                    <a:blip r:embed="rId21"/>
+                    <a:stretch>
+                      <a:fillRect/>
+                    </a:stretch>
+                  </pic:blipFill>
+                  <pic:spPr>
+                    <a:xfrm>
+                      <a:off x="0" y="0"/>
+                      <a:ext cx="5943600" cy="2140129"/>
+                    </a:xfrm>
+                    <a:prstGeom prst="rect"/>
+                  </pic:spPr>
+                </pic:pic>
+              </a:graphicData>
+            </a:graphic>
+          </wp:inline>
+        </w:drawing>
+      </w:r>
+    </w:p>
+    <w:p>
+      <w:pPr>
+        <w:pStyle w:val="Caption"/>
+        <w:jc w:val="center"/>
+      </w:pPr>
+      <w:r>
+        <w:rPr>
+          <w:b w:val="0"/>
+        </w:rPr>
+        <w:t>Figure 11. The earlier locked test: runs that met the case's outcome, per policy and suite.</w:t>
       </w:r>
     </w:p>
     <w:p>
@@ -4799,7 +4825,7 @@
                 <w:b w:val="0"/>
                 <w:sz w:val="19"/>
               </w:rPr>
-              <w:t>P0 rules</w:t>
+              <w:t>Fixed rules</w:t>
             </w:r>
           </w:p>
         </w:tc>
@@ -4906,7 +4932,7 @@
                 <w:b w:val="0"/>
                 <w:sz w:val="19"/>
               </w:rPr>
-              <w:t>P1 tool use</w:t>
+              <w:t>Tool-calling model</w:t>
             </w:r>
           </w:p>
         </w:tc>
@@ -5013,7 +5039,7 @@
                 <w:b w:val="0"/>
                 <w:sz w:val="19"/>
               </w:rPr>
-              <w:t>P2 selective (mine)</w:t>
+              <w:t>Our coordinator</w:t>
             </w:r>
           </w:p>
         </w:tc>
@@ -5120,7 +5146,7 @@
                 <w:b w:val="0"/>
                 <w:sz w:val="19"/>
               </w:rPr>
-              <w:t>P3 verify all</w:t>
+              <w:t>Check-all variant</w:t>
             </w:r>
           </w:p>
         </w:tc>
@@ -5390,7 +5416,7 @@
                 <w:b w:val="0"/>
                 <w:sz w:val="19"/>
               </w:rPr>
-              <w:t>P0 rules</w:t>
+              <w:t>Fixed rules</w:t>
             </w:r>
           </w:p>
         </w:tc>
@@ -5514,7 +5540,7 @@
                 <w:b w:val="0"/>
                 <w:sz w:val="19"/>
               </w:rPr>
-              <w:t>P1 tool use</w:t>
+              <w:t>Tool-calling model</w:t>
             </w:r>
           </w:p>
         </w:tc>
@@ -5638,7 +5664,7 @@
                 <w:b w:val="0"/>
                 <w:sz w:val="19"/>
               </w:rPr>
-              <w:t>P2 selective (mine)</w:t>
+              <w:t>Our coordinator</w:t>
             </w:r>
           </w:p>
         </w:tc>
@@ -5762,7 +5788,7 @@
                 <w:b w:val="0"/>
                 <w:sz w:val="19"/>
               </w:rPr>
-              <w:t>P3 verify all</w:t>
+              <w:t>Check-all variant</w:t>
             </w:r>
           </w:p>
         </w:tc>
@@ -5876,7 +5902,7 @@
         <w:rPr>
           <w:b w:val="0"/>
         </w:rPr>
-        <w:t>On C08, P0's infeasibility report was decided by the policy, P1's three by the model, and P2's and P3's three each by the server's shared narration. A refused request is a coordinator call that the server rejected, so nothing it asked for happened. Across both suites 39 of the 55 refused requests were made on a state that had changed meanwhile, which is retryable by design.</w:t>
+        <w:t>On C08, the fixed rules' infeasibility report was decided by the policy, the tool-calling model's three by the model, and our coordinator's and the check-all variant's three each by the server's shared narration. A refused request is a coordinator call that the server rejected, so nothing it asked for happened. Across both suites 39 of the 55 refused requests were made on a state that had changed meanwhile, which is retryable by design.</w:t>
       </w:r>
     </w:p>
     <w:p>
@@ -6046,7 +6072,7 @@
                 <w:b w:val="0"/>
                 <w:sz w:val="19"/>
               </w:rPr>
-              <w:t>P0 rules</w:t>
+              <w:t>Fixed rules</w:t>
             </w:r>
           </w:p>
         </w:tc>
@@ -6153,7 +6179,7 @@
                 <w:b w:val="0"/>
                 <w:sz w:val="19"/>
               </w:rPr>
-              <w:t>P1 tool use</w:t>
+              <w:t>Tool-calling model</w:t>
             </w:r>
           </w:p>
         </w:tc>
@@ -6260,7 +6286,7 @@
                 <w:b w:val="0"/>
                 <w:sz w:val="19"/>
               </w:rPr>
-              <w:t>P2 selective (mine)</w:t>
+              <w:t>Our coordinator</w:t>
             </w:r>
           </w:p>
         </w:tc>
@@ -6367,7 +6393,7 @@
                 <w:b w:val="0"/>
                 <w:sz w:val="19"/>
               </w:rPr>
-              <w:t>P3 verify all</w:t>
+              <w:t>Check-all variant</w:t>
             </w:r>
           </w:p>
         </w:tc>
@@ -6637,7 +6663,7 @@
                 <w:b w:val="0"/>
                 <w:sz w:val="19"/>
               </w:rPr>
-              <w:t>P0 rules</w:t>
+              <w:t>Fixed rules</w:t>
             </w:r>
           </w:p>
         </w:tc>
@@ -6761,7 +6787,7 @@
                 <w:b w:val="0"/>
                 <w:sz w:val="19"/>
               </w:rPr>
-              <w:t>P1 tool use</w:t>
+              <w:t>Tool-calling model</w:t>
             </w:r>
           </w:p>
         </w:tc>
@@ -6885,7 +6911,7 @@
                 <w:b w:val="0"/>
                 <w:sz w:val="19"/>
               </w:rPr>
-              <w:t>P2 selective (mine)</w:t>
+              <w:t>Our coordinator</w:t>
             </w:r>
           </w:p>
         </w:tc>
@@ -7009,7 +7035,7 @@
                 <w:b w:val="0"/>
                 <w:sz w:val="19"/>
               </w:rPr>
-              <w:t>P3 verify all</w:t>
+              <w:t>Check-all variant</w:t>
             </w:r>
           </w:p>
         </w:tc>
@@ -7123,7 +7149,7 @@
         <w:rPr>
           <w:b w:val="0"/>
         </w:rPr>
-        <w:t>Kits on time are summed over a policy's runs against the summed original targets. For pantry partial fulfillment, P0's two reports were decided by the policy, and P2's and P3's (T04, three each) by the server. P1's three T03 deficit reports were decided by the model but did not meet the class.</w:t>
+        <w:t>Kits on time are summed over a policy's runs against the summed original targets. For pantry partial fulfillment, the fixed rules' two reports were decided by the policy, and those of our coordinator and the check-all variant (T04, three each) by the server. The tool-calling model's three T03 deficit reports were decided by the model but did not meet the class.</w:t>
       </w:r>
     </w:p>
     <w:p>
@@ -7132,6 +7158,98 @@
       </w:pPr>
       <w:r>
         <w:t>12.3 Per-case figures from the report</w:t>
+      </w:r>
+    </w:p>
+    <w:p>
+      <w:r>
+        <w:rPr>
+          <w:b w:val="0"/>
+        </w:rPr>
+        <w:t xml:space="preserve">The report's own per-case figures stay in the repository: </w:t>
+      </w:r>
+      <w:r>
+        <w:rPr>
+          <w:rStyle w:val="InlineCode"/>
+        </w:rPr>
+        <w:t>campus/report/figure.svg</w:t>
+      </w:r>
+      <w:r>
+        <w:rPr>
+          <w:b w:val="0"/>
+        </w:rPr>
+        <w:t xml:space="preserve"> and </w:t>
+      </w:r>
+      <w:r>
+        <w:rPr>
+          <w:rStyle w:val="InlineCode"/>
+        </w:rPr>
+        <w:t>pantry/report/figure.svg</w:t>
+      </w:r>
+      <w:r>
+        <w:rPr>
+          <w:b w:val="0"/>
+        </w:rPr>
+        <w:t xml:space="preserve"> of the run, with printed copies in </w:t>
+      </w:r>
+      <w:r>
+        <w:rPr>
+          <w:rStyle w:val="InlineCode"/>
+        </w:rPr>
+        <w:t>PEEAI_plan/submission/slides/figures/report_campus.pdf</w:t>
+      </w:r>
+      <w:r>
+        <w:rPr>
+          <w:b w:val="0"/>
+        </w:rPr>
+        <w:t xml:space="preserve"> and </w:t>
+      </w:r>
+      <w:r>
+        <w:rPr>
+          <w:rStyle w:val="InlineCode"/>
+        </w:rPr>
+        <w:t>report_pantry.pdf</w:t>
+      </w:r>
+      <w:r>
+        <w:rPr>
+          <w:b w:val="0"/>
+        </w:rPr>
+        <w:t>.</w:t>
+      </w:r>
+    </w:p>
+    <w:p>
+      <w:pPr>
+        <w:pStyle w:val="Heading2"/>
+      </w:pPr>
+      <w:r>
+        <w:t>12.4 One success, one failure, and the other failures</w:t>
+      </w:r>
+    </w:p>
+    <w:p>
+      <w:r>
+        <w:rPr>
+          <w:b/>
+        </w:rPr>
+        <w:t>One success.</w:t>
+      </w:r>
+      <w:r>
+        <w:rPr>
+          <w:b w:val="0"/>
+        </w:rPr>
+        <w:t xml:space="preserve"> C01, a genuine projector delivery delay, was met in every run by every policy (10 of 10), scored from the final state and the receipts. The three quiet cases C02 to C04 were met in all 30 of their runs with no committed change.</w:t>
+      </w:r>
+    </w:p>
+    <w:p>
+      <w:r>
+        <w:rPr>
+          <w:b/>
+        </w:rPr>
+        <w:t>One failure.</w:t>
+      </w:r>
+      <w:r>
+        <w:rPr>
+          <w:b w:val="0"/>
+        </w:rPr>
+        <w:t xml:space="preserve"> In C06 (a volunteer will be late, with a later check-in), our coordinator and the check-all variant read the volunteer's message correctly in all six runs. But the frozen attention rule treats only equipment notices as material, so the reading never reached the planner, the plan was never put in question, and the activity the volunteer leads could not start in time. The earliest broken stage is planner input. The fixed rules' parser does not read the message. The tool-calling model met C06 in 3 of 3 runs. This limit was disclosed at the case lock, before the runs.</w:t>
       </w:r>
     </w:p>
     <w:p>
@@ -7142,172 +7260,8 @@
       <w:r>
         <w:drawing>
           <wp:inline xmlns:a="http://schemas.openxmlformats.org/drawingml/2006/main" xmlns:pic="http://schemas.openxmlformats.org/drawingml/2006/picture">
-            <wp:extent cx="5120640" cy="3739356"/>
-            <wp:docPr id="13" name="Picture 13"/>
-            <wp:cNvGraphicFramePr>
-              <a:graphicFrameLocks noChangeAspect="1"/>
-            </wp:cNvGraphicFramePr>
-            <a:graphic>
-              <a:graphicData uri="http://schemas.openxmlformats.org/drawingml/2006/picture">
-                <pic:pic>
-                  <pic:nvPicPr>
-                    <pic:cNvPr id="0" name="report_campus.png"/>
-                    <pic:cNvPicPr/>
-                  </pic:nvPicPr>
-                  <pic:blipFill>
-                    <a:blip r:embed="rId23"/>
-                    <a:stretch>
-                      <a:fillRect/>
-                    </a:stretch>
-                  </pic:blipFill>
-                  <pic:spPr>
-                    <a:xfrm>
-                      <a:off x="0" y="0"/>
-                      <a:ext cx="5120640" cy="3739356"/>
-                    </a:xfrm>
-                    <a:prstGeom prst="rect"/>
-                  </pic:spPr>
-                </pic:pic>
-              </a:graphicData>
-            </a:graphic>
-          </wp:inline>
-        </w:drawing>
-      </w:r>
-    </w:p>
-    <w:p>
-      <w:pPr>
-        <w:pStyle w:val="Caption"/>
-        <w:jc w:val="center"/>
-      </w:pPr>
-      <w:r>
-        <w:rPr>
-          <w:b w:val="0"/>
-        </w:rPr>
-        <w:t>Figure 13. The report's per-case figure, campus (</w:t>
-      </w:r>
-      <w:r>
-        <w:rPr>
-          <w:rStyle w:val="InlineCode"/>
-        </w:rPr>
-        <w:t>campus/report/figure.svg</w:t>
-      </w:r>
-      <w:r>
-        <w:rPr>
-          <w:b w:val="0"/>
-        </w:rPr>
-        <w:t>).</w:t>
-      </w:r>
-    </w:p>
-    <w:p>
-      <w:pPr>
-        <w:keepNext/>
-        <w:jc w:val="center"/>
-      </w:pPr>
-      <w:r>
-        <w:drawing>
-          <wp:inline xmlns:a="http://schemas.openxmlformats.org/drawingml/2006/main" xmlns:pic="http://schemas.openxmlformats.org/drawingml/2006/picture">
-            <wp:extent cx="5120640" cy="2241216"/>
-            <wp:docPr id="14" name="Picture 14"/>
-            <wp:cNvGraphicFramePr>
-              <a:graphicFrameLocks noChangeAspect="1"/>
-            </wp:cNvGraphicFramePr>
-            <a:graphic>
-              <a:graphicData uri="http://schemas.openxmlformats.org/drawingml/2006/picture">
-                <pic:pic>
-                  <pic:nvPicPr>
-                    <pic:cNvPr id="0" name="report_pantry.png"/>
-                    <pic:cNvPicPr/>
-                  </pic:nvPicPr>
-                  <pic:blipFill>
-                    <a:blip r:embed="rId24"/>
-                    <a:stretch>
-                      <a:fillRect/>
-                    </a:stretch>
-                  </pic:blipFill>
-                  <pic:spPr>
-                    <a:xfrm>
-                      <a:off x="0" y="0"/>
-                      <a:ext cx="5120640" cy="2241216"/>
-                    </a:xfrm>
-                    <a:prstGeom prst="rect"/>
-                  </pic:spPr>
-                </pic:pic>
-              </a:graphicData>
-            </a:graphic>
-          </wp:inline>
-        </w:drawing>
-      </w:r>
-    </w:p>
-    <w:p>
-      <w:pPr>
-        <w:pStyle w:val="Caption"/>
-        <w:jc w:val="center"/>
-      </w:pPr>
-      <w:r>
-        <w:rPr>
-          <w:b w:val="0"/>
-        </w:rPr>
-        <w:t>Figure 14. The report's per-case figure, pantry (</w:t>
-      </w:r>
-      <w:r>
-        <w:rPr>
-          <w:rStyle w:val="InlineCode"/>
-        </w:rPr>
-        <w:t>pantry/report/figure.svg</w:t>
-      </w:r>
-      <w:r>
-        <w:rPr>
-          <w:b w:val="0"/>
-        </w:rPr>
-        <w:t>).</w:t>
-      </w:r>
-    </w:p>
-    <w:p>
-      <w:pPr>
-        <w:pStyle w:val="Heading2"/>
-      </w:pPr>
-      <w:r>
-        <w:t>12.4 One success, one failure, and the other failures</w:t>
-      </w:r>
-    </w:p>
-    <w:p>
-      <w:r>
-        <w:rPr>
-          <w:b/>
-        </w:rPr>
-        <w:t>One success.</w:t>
-      </w:r>
-      <w:r>
-        <w:rPr>
-          <w:b w:val="0"/>
-        </w:rPr>
-        <w:t xml:space="preserve"> C01, a genuine projector delivery delay, was met in every run by every policy (10 of 10), scored from the final state and the receipts. The three quiet cases C02 to C04 were met in all 30 of their runs with no committed change.</w:t>
-      </w:r>
-    </w:p>
-    <w:p>
-      <w:r>
-        <w:rPr>
-          <w:b/>
-        </w:rPr>
-        <w:t>One failure.</w:t>
-      </w:r>
-      <w:r>
-        <w:rPr>
-          <w:b w:val="0"/>
-        </w:rPr>
-        <w:t xml:space="preserve"> In C06 (a volunteer will be late, with a later check-in), P2 and P3 read the volunteer's message correctly in all six runs. But the frozen attention rule treats only equipment notices as material, so the reading never reached the planner, the plan was never put in question, and the activity the volunteer leads could not start in time. The earliest broken stage is planner input. P0's parser does not read the message. P1 met C06 in 3 of 3 runs. This limit was disclosed at the case lock, before the runs.</w:t>
-      </w:r>
-    </w:p>
-    <w:p>
-      <w:pPr>
-        <w:keepNext/>
-        <w:jc w:val="center"/>
-      </w:pPr>
-      <w:r>
-        <w:drawing>
-          <wp:inline xmlns:a="http://schemas.openxmlformats.org/drawingml/2006/main" xmlns:pic="http://schemas.openxmlformats.org/drawingml/2006/picture">
-            <wp:extent cx="5943600" cy="1139334"/>
-            <wp:docPr id="15" name="Picture 15"/>
+            <wp:extent cx="5943600" cy="1138444"/>
+            <wp:docPr id="12" name="Picture 12"/>
             <wp:cNvGraphicFramePr>
               <a:graphicFrameLocks noChangeAspect="1"/>
             </wp:cNvGraphicFramePr>
@@ -7319,7 +7273,7 @@
                     <pic:cNvPicPr/>
                   </pic:nvPicPr>
                   <pic:blipFill>
-                    <a:blip r:embed="rId25"/>
+                    <a:blip r:embed="rId22"/>
                     <a:stretch>
                       <a:fillRect/>
                     </a:stretch>
@@ -7327,7 +7281,7 @@
                   <pic:spPr>
                     <a:xfrm>
                       <a:off x="0" y="0"/>
-                      <a:ext cx="5943600" cy="1139334"/>
+                      <a:ext cx="5943600" cy="1138444"/>
                     </a:xfrm>
                     <a:prstGeom prst="rect"/>
                   </pic:spPr>
@@ -7347,7 +7301,7 @@
         <w:rPr>
           <w:b w:val="0"/>
         </w:rPr>
-        <w:t>Figure 15. The C06 failure of P2 and P3 in four steps.</w:t>
+        <w:t>Figure 12. The C06 failure of our coordinator and the check-all variant in four steps.</w:t>
       </w:r>
     </w:p>
     <w:p>
@@ -7384,7 +7338,7 @@
         <w:rPr>
           <w:b w:val="0"/>
         </w:rPr>
-        <w:t xml:space="preserve"> (status service unavailable), P2 in 3 runs, action selection: a repeated check and a hold released and made again used the 8 model calls, and the organizer's approval arrived after the last one. P0 missed C07 too (interpretation), because its parser does not read the message.</w:t>
+        <w:t xml:space="preserve"> (status service unavailable), our coordinator in 3 runs, action selection: a repeated check and a hold released and made again used the 8 model calls, and the organizer's approval arrived after the last one. The fixed rules missed C07 too (interpretation), because its parser does not read the message.</w:t>
       </w:r>
     </w:p>
     <w:p>
@@ -7401,7 +7355,7 @@
         <w:rPr>
           <w:b w:val="0"/>
         </w:rPr>
-        <w:t>, P3 in 3 runs, execution: a correct apply was refused as stale during a one-minute tool call, and the remaining model calls went to reading new notices, so it was never retried.</w:t>
+        <w:t>, the check-all variant in 3 runs, execution: a correct apply was refused as stale during a one-minute tool call, and the remaining model calls went to reading new notices, so it was never retried.</w:t>
       </w:r>
     </w:p>
     <w:p>
@@ -7418,7 +7372,7 @@
         <w:rPr>
           <w:b w:val="0"/>
         </w:rPr>
-        <w:t>, P1 in 6 runs, action selection: P1 never held or committed the kits on hand.</w:t>
+        <w:t>, the tool-calling model in 6 runs, action selection: the tool-calling model never held or committed the kits on hand.</w:t>
       </w:r>
     </w:p>
     <w:p>
@@ -7435,7 +7389,7 @@
         <w:rPr>
           <w:b w:val="0"/>
         </w:rPr>
-        <w:t>, P2 and P3 in 3 runs each, planner input (for P2 borderline with action selection): a defect in my frozen planner and menu kept a pool checked as unavailable as a ranked handoff option, and the shortfall report waited on it.</w:t>
+        <w:t>, our coordinator and the check-all variant in 3 runs each, planner input (for our coordinator borderline with action selection): a defect in my frozen planner and menu kept a pool checked as unavailable as a ranked handoff option, and the shortfall report waited on it.</w:t>
       </w:r>
     </w:p>
     <w:p>
@@ -7468,7 +7422,7 @@
         <w:rPr>
           <w:b w:val="0"/>
         </w:rPr>
-        <w:t xml:space="preserve"> P1, the model calling tools freely, met all campus runs, with the most model use: 90 model calls and $3.01 on campus, against $1.00 for P2 and $0.57 for P3. On the pantry, fixed rules met 4/4 runs at no model cost, while the model policies met 6 to 9 of 12. P2 cost less than P1 (P3, with the same menu and server checks, cost less still on campus), and its misses trace to its frozen attention rule, choices that used up the call limit and the planner defect. These counts come from one reported run and do not show that any policy is better in general.</w:t>
+        <w:t xml:space="preserve"> The tool-calling model, the model calling tools freely, met all campus runs, with the most model use: 90 model calls and $3.01 on campus, against $1.00 for our coordinator and $0.57 for the check-all variant. On the pantry, fixed rules met 4/4 runs at no model cost, while the model policies met 6 to 9 of 12. Our coordinator cost less than the tool-calling model (the check-all variant, with the same menu and server checks, cost less still on campus), and its misses trace to its frozen attention rule, choices that used up the call limit and the planner defect. These counts come from one reported run and do not show that any policy is better in general.</w:t>
       </w:r>
     </w:p>
     <w:p>
@@ -7513,7 +7467,7 @@
         <w:rPr>
           <w:b w:val="0"/>
         </w:rPr>
-        <w:t xml:space="preserve"> Only P2 and P3 had pantry guidance in their prompts, so the pantry partial-fulfillment counts cannot be credited to the controller alone.</w:t>
+        <w:t xml:space="preserve"> Only our coordinator and the check-all variant had pantry guidance in their prompts, so the pantry partial-fulfillment counts cannot be credited to the controller alone.</w:t>
       </w:r>
     </w:p>
     <w:p>
@@ -7669,7 +7623,7 @@
         <w:rPr>
           <w:b w:val="0"/>
         </w:rPr>
-        <w:t>). The spoken script is 932 words, about 6 minutes 39 seconds at 140 words a minute, inside the 7 minutes.</w:t>
+        <w:t>). The spoken script is 922 counted words, about 6 minutes 35 seconds at 140 words a minute, inside the 7 minutes.</w:t>
       </w:r>
     </w:p>
     <w:p>
@@ -7677,7 +7631,7 @@
         <w:pStyle w:val="Heading2"/>
       </w:pPr>
       <w:r>
-        <w:t>12.7 Wave 3b: version 1.2</w:t>
+        <w:t>12.7 The final system on six new cases, in full (Wave 3b, version 1.2)</w:t>
       </w:r>
     </w:p>
     <w:p>
@@ -7703,7 +7657,7 @@
         <w:rPr>
           <w:b w:val="0"/>
         </w:rPr>
-        <w:t xml:space="preserve"> names them. Version 1.2 (P1 </w:t>
+        <w:t xml:space="preserve"> names them. Version 1.2 (the tool-calling model </w:t>
       </w:r>
       <w:r>
         <w:rPr>
@@ -7715,7 +7669,7 @@
         <w:rPr>
           <w:b w:val="0"/>
         </w:rPr>
-        <w:t xml:space="preserve">, P2 </w:t>
+        <w:t xml:space="preserve">, our coordinator </w:t>
       </w:r>
       <w:r>
         <w:rPr>
@@ -7727,7 +7681,7 @@
         <w:rPr>
           <w:b w:val="0"/>
         </w:rPr>
-        <w:t xml:space="preserve">, P3 </w:t>
+        <w:t xml:space="preserve">, the check-all variant </w:t>
       </w:r>
       <w:r>
         <w:rPr>
@@ -7819,7 +7773,7 @@
         <w:rPr>
           <w:b w:val="0"/>
         </w:rPr>
-        <w:t xml:space="preserve"> (T02). In 1.1 a choice refused only because the state had changed went back to the model. In 1.2 P2 and P3 send it again without a model call when the re-read menu still offers it.</w:t>
+        <w:t xml:space="preserve"> (T02). In 1.1 a choice refused only because the state had changed went back to the model. In 1.2 our coordinator and the check-all variant send it again without a model call when the re-read menu still offers it.</w:t>
       </w:r>
     </w:p>
     <w:p>
@@ -7847,7 +7801,7 @@
         <w:rPr>
           <w:b w:val="0"/>
         </w:rPr>
-        <w:t xml:space="preserve">P0's code and ids are unchanged, but it shares the planner, so the freeze records the planner version </w:t>
+        <w:t xml:space="preserve">The fixed rules' code and ids are unchanged, but they share the planner, so the freeze records the planner version </w:t>
       </w:r>
       <w:r>
         <w:rPr>
@@ -7983,7 +7937,7 @@
                 <w:b/>
                 <w:sz w:val="19"/>
               </w:rPr>
-              <w:t>P0 rules</w:t>
+              <w:t>Fixed rules</w:t>
             </w:r>
           </w:p>
         </w:tc>
@@ -8001,7 +7955,7 @@
                 <w:b/>
                 <w:sz w:val="19"/>
               </w:rPr>
-              <w:t>P1 tool use</w:t>
+              <w:t>Tool-calling model</w:t>
             </w:r>
           </w:p>
         </w:tc>
@@ -8019,7 +7973,7 @@
                 <w:b/>
                 <w:sz w:val="19"/>
               </w:rPr>
-              <w:t>P2 selective (mine)</w:t>
+              <w:t>Our coordinator</w:t>
             </w:r>
           </w:p>
         </w:tc>
@@ -8037,7 +7991,7 @@
                 <w:b/>
                 <w:sz w:val="19"/>
               </w:rPr>
-              <w:t>P3 verify all</w:t>
+              <w:t>Check-all variant</w:t>
             </w:r>
           </w:p>
         </w:tc>
@@ -8059,7 +8013,7 @@
                 <w:b w:val="0"/>
                 <w:sz w:val="19"/>
               </w:rPr>
-              <w:t>v1.1 held-out, evaluation of record: campus C01 to C08</w:t>
+              <w:t>v1.1 earlier locked test: campus C01 to C08</w:t>
             </w:r>
           </w:p>
         </w:tc>
@@ -8166,7 +8120,7 @@
                 <w:b w:val="0"/>
                 <w:sz w:val="19"/>
               </w:rPr>
-              <w:t>v1.1 held-out, evaluation of record: pantry T01 to T04</w:t>
+              <w:t>v1.1 earlier locked test: pantry T01 to T04</w:t>
             </w:r>
           </w:p>
         </w:tc>
@@ -8826,7 +8780,7 @@
                 <w:b w:val="0"/>
                 <w:sz w:val="19"/>
               </w:rPr>
-              <w:t>v1.1 held-out, evaluation of record: campus C01 to C08</w:t>
+              <w:t>v1.1 earlier locked test: campus C01 to C08</w:t>
             </w:r>
           </w:p>
         </w:tc>
@@ -8916,7 +8870,7 @@
                 <w:b w:val="0"/>
                 <w:sz w:val="19"/>
               </w:rPr>
-              <w:t>v1.1 held-out, evaluation of record: pantry T01 to T04</w:t>
+              <w:t>v1.1 earlier locked test: pantry T01 to T04</w:t>
             </w:r>
           </w:p>
         </w:tc>
@@ -9402,7 +9356,7 @@
         <w:rPr>
           <w:b w:val="0"/>
         </w:rPr>
-        <w:t>). Version 1.2 met the outcome in 59 of 60 runs. The one miss is P0 on C11, a late volunteer whose own report P0's frozen parser does not read, the same gap by construction as P0 on C06. P1, P2 and P3 met every run, 12/12 each on campus and 6/6 each on the pantry. No run reached the 8-call limit, all 194 model calls were answered, and the negative control C10 had no committed change in any of its 10 runs.</w:t>
+        <w:t>). Version 1.2 met the outcome in 59 of 60 runs. The one miss is the fixed rules on C11, a late volunteer whose own report the fixed rules' frozen parser does not read, the same gap by construction as the fixed rules on C06. The tool-calling model, our coordinator and the check-all variant met every run, 12/12 each on campus and 6/6 each on the pantry. No run reached the 8-call limit, all 194 model calls were answered, and the negative control C10 had no committed change in any of its 10 runs.</w:t>
       </w:r>
     </w:p>
     <w:p>
@@ -9430,13 +9384,13 @@
         <w:rPr>
           <w:b/>
         </w:rPr>
-        <w:t>P2 still shows no consistent advantage.</w:t>
+        <w:t>Our coordinator still shows no consistent advantage.</w:t>
       </w:r>
       <w:r>
         <w:rPr>
           <w:b w:val="0"/>
         </w:rPr>
-        <w:t xml:space="preserve"> P1, P2 and P3 all met every fresh run, so the fresh set cannot separate them. Model charges over both fresh suites were $2.32 for P1, $0.76 for P2 and $0.53 for P3.</w:t>
+        <w:t xml:space="preserve"> The tool-calling model, our coordinator and the check-all variant all met every fresh run, so the fresh set cannot separate them. Model charges over both fresh suites were $2.32 for the tool-calling model, $0.76 for our coordinator and $0.53 for the check-all variant.</w:t>
       </w:r>
     </w:p>
     <w:p>
@@ -9465,7 +9419,7 @@
         <w:rPr>
           <w:b w:val="0"/>
         </w:rPr>
-        <w:t>). Its counts are consistent with the fixes on the failures that motivated them: the C06 misses of P2 and P3 and the T03 misses did not recur. The C07 failure of P2 (a hold made, released and made again until the call limit) and the T02 failure of P3 (an apply refused as stale, whose retry needed a model call that the limit did not leave) remain, and P1 missed T04 in two of three runs. The fixes were made after reading these cases, so the rerun cannot show that 1.2 is better.</w:t>
+        <w:t>). Its counts are consistent with the fixes on the failures that motivated them: the C06 misses of our coordinator and the check-all variant and the T03 misses did not recur. The C07 failure of our coordinator (a hold made, released and made again until the call limit) and the T02 failure of the check-all variant (an apply refused as stale, whose retry needed a model call that the limit did not leave) remain, and the tool-calling model missed T04 in two of three runs. The fixes were made after reading these cases, so the rerun cannot show that 1.2 is better.</w:t>
       </w:r>
     </w:p>
     <w:p>
@@ -9611,7 +9565,7 @@
         <w:rPr>
           <w:b w:val="0"/>
         </w:rPr>
-        <w:t xml:space="preserve">, found by the audit before the freeze and left frozen: a person's delay hypothesis outlives a later check-in, the declined-menu rule holds no time (so a timed wake with the same options gets no model call), P1 notes a declined menu with the view after its turn, a stale re-send is recorded as a model choice, and a long </w:t>
+        <w:t xml:space="preserve">, found by the audit before the freeze and left frozen: a person's delay hypothesis outlives a later check-in, the declined-menu rule holds no time (so a timed wake with the same options gets no model call), the tool-calling model notes a declined menu with the view after its turn, a stale re-send is recorded as a model choice, and a long </w:t>
       </w:r>
       <w:r>
         <w:rPr>
@@ -9703,7 +9657,7 @@
         <w:rPr>
           <w:b w:val="0"/>
         </w:rPr>
-        <w:t xml:space="preserve"> A P2 versus P0 difference does not separate the decision policy from language reading.</w:t>
+        <w:t xml:space="preserve"> A difference between our coordinator and the fixed rules does not separate the decision policy from language reading.</w:t>
       </w:r>
     </w:p>
     <w:p>
@@ -10174,7 +10128,7 @@
         <w:rPr>
           <w:b w:val="0"/>
         </w:rPr>
-        <w:t xml:space="preserve">The model policies P1 to P3 make paid calls. They need an OpenAI-compatible endpoint such as OpenRouter, set in </w:t>
+        <w:t xml:space="preserve">The three model approaches make paid calls. They need an OpenAI-compatible endpoint such as OpenRouter, set in </w:t>
       </w:r>
       <w:r>
         <w:rPr>
@@ -10272,7 +10226,7 @@
                 <w:b/>
                 <w:sz w:val="19"/>
               </w:rPr>
-              <w:t>Segment</w:t>
+              <w:t>Slide</w:t>
             </w:r>
           </w:p>
         </w:tc>
@@ -10290,7 +10244,7 @@
                 <w:b/>
                 <w:sz w:val="19"/>
               </w:rPr>
-              <w:t>Case</w:t>
+              <w:t>Scenario to load</w:t>
             </w:r>
           </w:p>
         </w:tc>
@@ -10330,7 +10284,7 @@
                 <w:b w:val="0"/>
                 <w:sz w:val="19"/>
               </w:rPr>
-              <w:t>0:00 to 0:37</w:t>
+              <w:t>0:00 to 0:36</w:t>
             </w:r>
           </w:p>
         </w:tc>
@@ -10347,7 +10301,7 @@
                 <w:b w:val="0"/>
                 <w:sz w:val="19"/>
               </w:rPr>
-              <w:t>The problem</w:t>
+              <w:t>Title, then 16:40, twenty minutes to doors open</w:t>
             </w:r>
           </w:p>
         </w:tc>
@@ -10381,7 +10335,7 @@
                 <w:b w:val="0"/>
                 <w:sz w:val="19"/>
               </w:rPr>
-              <w:t>Goal, deadline, the 16:40 notice</w:t>
+              <w:t>Goal, deadline, the 16:40 text</w:t>
             </w:r>
           </w:p>
         </w:tc>
@@ -10403,7 +10357,7 @@
                 <w:b w:val="0"/>
                 <w:sz w:val="19"/>
               </w:rPr>
-              <w:t>0:37 to 1:12</w:t>
+              <w:t>0:36 to 1:21</w:t>
             </w:r>
           </w:p>
         </w:tc>
@@ -10420,7 +10374,7 @@
                 <w:b w:val="0"/>
                 <w:sz w:val="19"/>
               </w:rPr>
-              <w:t>Who may do what</w:t>
+              <w:t>An agent with no gate against Plan B</w:t>
             </w:r>
           </w:p>
         </w:tc>
@@ -10432,13 +10386,6 @@
             <w:pPr>
               <w:spacing w:after="40"/>
             </w:pPr>
-            <w:r>
-              <w:rPr>
-                <w:b w:val="0"/>
-                <w:sz w:val="19"/>
-              </w:rPr>
-              <w:t>dev01</w:t>
-            </w:r>
           </w:p>
         </w:tc>
         <w:tc>
@@ -10454,7 +10401,7 @@
                 <w:b w:val="0"/>
                 <w:sz w:val="19"/>
               </w:rPr>
-              <w:t>The coordinator's grant</w:t>
+              <w:t>The idea: the model chooses, the gate decides</w:t>
             </w:r>
           </w:p>
         </w:tc>
@@ -10476,7 +10423,7 @@
                 <w:b w:val="0"/>
                 <w:sz w:val="19"/>
               </w:rPr>
-              <w:t>1:12 to 2:35</w:t>
+              <w:t>1:21 to 2:17</w:t>
             </w:r>
           </w:p>
         </w:tc>
@@ -10493,7 +10440,7 @@
                 <w:b w:val="0"/>
                 <w:sz w:val="19"/>
               </w:rPr>
-              <w:t>Verify, then commit</w:t>
+              <w:t>One fact checked, two activities swapped</w:t>
             </w:r>
           </w:p>
         </w:tc>
@@ -10549,7 +10496,7 @@
                 <w:b w:val="0"/>
                 <w:sz w:val="19"/>
               </w:rPr>
-              <w:t>2:35 to 3:25</w:t>
+              <w:t>2:17 to 2:44</w:t>
             </w:r>
           </w:p>
         </w:tc>
@@ -10566,7 +10513,7 @@
                 <w:b w:val="0"/>
                 <w:sz w:val="19"/>
               </w:rPr>
-              <w:t>Four messages, zero changes</w:t>
+              <w:t>Most messages change nothing</w:t>
             </w:r>
           </w:p>
         </w:tc>
@@ -10622,7 +10569,7 @@
                 <w:b w:val="0"/>
                 <w:sz w:val="19"/>
               </w:rPr>
-              <w:t>3:25 to 4:23</w:t>
+              <w:t>2:44 to 3:44</w:t>
             </w:r>
           </w:p>
         </w:tc>
@@ -10639,7 +10586,7 @@
                 <w:b w:val="0"/>
                 <w:sz w:val="19"/>
               </w:rPr>
-              <w:t>The loop and the gate</w:t>
+              <w:t>The design</w:t>
             </w:r>
           </w:p>
         </w:tc>
@@ -10695,7 +10642,7 @@
                 <w:b w:val="0"/>
                 <w:sz w:val="19"/>
               </w:rPr>
-              <w:t>4:23 to 5:39</w:t>
+              <w:t>3:44 to 4:48</w:t>
             </w:r>
           </w:p>
         </w:tc>
@@ -10712,7 +10659,7 @@
                 <w:b w:val="0"/>
                 <w:sz w:val="19"/>
               </w:rPr>
-              <w:t>Held-out results</w:t>
+              <w:t>The test on six new cases</w:t>
             </w:r>
           </w:p>
         </w:tc>
@@ -10746,7 +10693,7 @@
                 <w:b w:val="0"/>
                 <w:sz w:val="19"/>
               </w:rPr>
-              <w:t>Counts and one failure</w:t>
+              <w:t>59 of 60 runs met, the one miss, the gate</w:t>
             </w:r>
           </w:p>
         </w:tc>
@@ -10768,7 +10715,7 @@
                 <w:b w:val="0"/>
                 <w:sz w:val="19"/>
               </w:rPr>
-              <w:t>5:39 to 6:29</w:t>
+              <w:t>4:48 to 5:27</w:t>
             </w:r>
           </w:p>
         </w:tc>
@@ -10785,7 +10732,7 @@
                 <w:b w:val="0"/>
                 <w:sz w:val="19"/>
               </w:rPr>
-              <w:t>Pantry cameo</w:t>
+              <w:t>The food pantry</w:t>
             </w:r>
           </w:p>
         </w:tc>
@@ -10819,7 +10766,7 @@
                 <w:b w:val="0"/>
                 <w:sz w:val="19"/>
               </w:rPr>
-              <w:t>The two counters</w:t>
+              <w:t>Late stock does not count, staff record</w:t>
             </w:r>
           </w:p>
         </w:tc>
@@ -10841,7 +10788,7 @@
                 <w:b w:val="0"/>
                 <w:sz w:val="19"/>
               </w:rPr>
-              <w:t>6:29 to 7:00</w:t>
+              <w:t>5:27 to 6:11</w:t>
             </w:r>
           </w:p>
         </w:tc>
@@ -10858,6 +10805,72 @@
                 <w:b w:val="0"/>
                 <w:sz w:val="19"/>
               </w:rPr>
+              <w:t>What is next</w:t>
+            </w:r>
+          </w:p>
+        </w:tc>
+        <w:tc>
+          <w:tcPr>
+            <w:tcW w:type="dxa" w:w="1584"/>
+          </w:tcPr>
+          <w:p>
+            <w:pPr>
+              <w:spacing w:after="40"/>
+            </w:pPr>
+          </w:p>
+        </w:tc>
+        <w:tc>
+          <w:tcPr>
+            <w:tcW w:type="dxa" w:w="3456"/>
+          </w:tcPr>
+          <w:p>
+            <w:pPr>
+              <w:spacing w:after="40"/>
+            </w:pPr>
+            <w:r>
+              <w:rPr>
+                <w:b w:val="0"/>
+                <w:sz w:val="19"/>
+              </w:rPr>
+              <w:t>Connected APIs, MBTA as context, a pilot</w:t>
+            </w:r>
+          </w:p>
+        </w:tc>
+      </w:tr>
+      <w:tr>
+        <w:trPr>
+          <w:cantSplit/>
+        </w:trPr>
+        <w:tc>
+          <w:tcPr>
+            <w:tcW w:type="dxa" w:w="1584"/>
+          </w:tcPr>
+          <w:p>
+            <w:pPr>
+              <w:spacing w:after="40"/>
+            </w:pPr>
+            <w:r>
+              <w:rPr>
+                <w:b w:val="0"/>
+                <w:sz w:val="19"/>
+              </w:rPr>
+              <w:t>6:11 to 6:41</w:t>
+            </w:r>
+          </w:p>
+        </w:tc>
+        <w:tc>
+          <w:tcPr>
+            <w:tcW w:type="dxa" w:w="2736"/>
+          </w:tcPr>
+          <w:p>
+            <w:pPr>
+              <w:spacing w:after="40"/>
+            </w:pPr>
+            <w:r>
+              <w:rPr>
+                <w:b w:val="0"/>
+                <w:sz w:val="19"/>
+              </w:rPr>
               <w:t>Close</w:t>
             </w:r>
           </w:p>
@@ -10885,7 +10898,7 @@
                 <w:b w:val="0"/>
                 <w:sz w:val="19"/>
               </w:rPr>
-              <w:t>What works, what is next</w:t>
+              <w:t>The callback and the one message</w:t>
             </w:r>
           </w:p>
         </w:tc>
@@ -10996,14 +11009,75 @@
       </w:r>
     </w:p>
     <w:p>
+      <w:r>
+        <w:rPr>
+          <w:b w:val="0"/>
+        </w:rPr>
+        <w:t>Three interfaces are connected today: the OpenRouter model API (</w:t>
+      </w:r>
+      <w:r>
+        <w:rPr>
+          <w:rStyle w:val="InlineCode"/>
+        </w:rPr>
+        <w:t>anthropic/claude-sonnet-5.5</w:t>
+      </w:r>
+      <w:r>
+        <w:rPr>
+          <w:b w:val="0"/>
+        </w:rPr>
+        <w:t>), the sandbox's tool API (status checks, holds, plan changes and receipts) and the board's HTTP API, where people approve spending, report and attest. Real feeds are the next step. The MBTA V3 API for live transit alerts is designed in, and a key exists, but the adapter was not built and no MBTA data is used. Transit data could only ever be context, never proof of a person's arrival.</w:t>
+      </w:r>
+    </w:p>
+    <w:p>
       <w:pPr>
-        <w:pStyle w:val="ListBullet"/>
+        <w:keepNext/>
+        <w:jc w:val="center"/>
       </w:pPr>
       <w:r>
+        <w:drawing>
+          <wp:inline xmlns:a="http://schemas.openxmlformats.org/drawingml/2006/main" xmlns:pic="http://schemas.openxmlformats.org/drawingml/2006/picture">
+            <wp:extent cx="5943600" cy="1746391"/>
+            <wp:docPr id="13" name="Picture 13"/>
+            <wp:cNvGraphicFramePr>
+              <a:graphicFrameLocks noChangeAspect="1"/>
+            </wp:cNvGraphicFramePr>
+            <a:graphic>
+              <a:graphicData uri="http://schemas.openxmlformats.org/drawingml/2006/picture">
+                <pic:pic>
+                  <pic:nvPicPr>
+                    <pic:cNvPr id="0" name="fig_next.png"/>
+                    <pic:cNvPicPr/>
+                  </pic:nvPicPr>
+                  <pic:blipFill>
+                    <a:blip r:embed="rId23"/>
+                    <a:stretch>
+                      <a:fillRect/>
+                    </a:stretch>
+                  </pic:blipFill>
+                  <pic:spPr>
+                    <a:xfrm>
+                      <a:off x="0" y="0"/>
+                      <a:ext cx="5943600" cy="1746391"/>
+                    </a:xfrm>
+                    <a:prstGeom prst="rect"/>
+                  </pic:spPr>
+                </pic:pic>
+              </a:graphicData>
+            </a:graphic>
+          </wp:inline>
+        </w:drawing>
+      </w:r>
+    </w:p>
+    <w:p>
+      <w:pPr>
+        <w:pStyle w:val="Caption"/>
+        <w:jc w:val="center"/>
+      </w:pPr>
+      <w:r>
         <w:rPr>
           <w:b w:val="0"/>
         </w:rPr>
-        <w:t>Review the workflows with community staff, starting with one bounded tabletop session.</w:t>
+        <w:t>Figure 13. Connected today (solid) and next (dashed).</w:t>
       </w:r>
     </w:p>
     <w:p>
@@ -11014,7 +11088,7 @@
         <w:rPr>
           <w:b w:val="0"/>
         </w:rPr>
-        <w:t>Store authorization requests as explicit state.</w:t>
+        <w:t>Review the workflows with community staff, starting with one bounded tabletop session, then a pilot with a campus event series where Plan B proposes and the organizer acts, counting messages, checks, changes and approvals.</w:t>
       </w:r>
     </w:p>
     <w:p>
@@ -11025,7 +11099,18 @@
         <w:rPr>
           <w:b w:val="0"/>
         </w:rPr>
-        <w:t>Add the optional MBTA transit context, labelled as uncertain information.</w:t>
+        <w:t>Store authorization requests as explicit state.</w:t>
+      </w:r>
+    </w:p>
+    <w:p>
+      <w:pPr>
+        <w:pStyle w:val="ListBullet"/>
+      </w:pPr>
+      <w:r>
+        <w:rPr>
+          <w:b w:val="0"/>
+        </w:rPr>
+        <w:t>Build the MBTA transit adapter, labelled as uncertain context, and replace the simulated status check with a supplier's real tracking page.</w:t>
       </w:r>
     </w:p>
     <w:p>
@@ -11458,7 +11543,7 @@
                 <w:b w:val="0"/>
                 <w:sz w:val="19"/>
               </w:rPr>
-              <w:t>The rule that picks the next step: P0 to P3</w:t>
+              <w:t>The rule that picks the next step: one of the four approaches</w:t>
             </w:r>
           </w:p>
         </w:tc>
@@ -11497,7 +11582,7 @@
                 <w:b w:val="0"/>
                 <w:sz w:val="19"/>
               </w:rPr>
-              <w:t>Fixed rules, a model calling tools, a model picking checked options, and P2 with every check</w:t>
+              <w:t>Fixed rules, the tool-calling model, our coordinator (picks checked options), and the check-all variant (every check first)</w:t>
             </w:r>
           </w:p>
         </w:tc>
@@ -12004,7 +12089,7 @@
                 <w:b w:val="0"/>
                 <w:sz w:val="19"/>
               </w:rPr>
-              <w:t>The P2 and P3 rule that decides whether a reading is material and needs the model</w:t>
+              <w:t>The rule of our coordinator and the check-all variant that decides whether a reading is material and needs the model</w:t>
             </w:r>
           </w:p>
         </w:tc>
@@ -12326,7 +12411,7 @@
                 <w:b w:val="0"/>
                 <w:sz w:val="19"/>
               </w:rPr>
-              <w:t>The runtime semantics, sections 1 to 20</w:t>
+              <w:t>The runtime semantics, sections 1 to 21</w:t>
             </w:r>
           </w:p>
         </w:tc>
@@ -12457,7 +12542,7 @@
                 <w:b w:val="0"/>
                 <w:sz w:val="19"/>
               </w:rPr>
-              <w:t>The development runs of P1 to P3</w:t>
+              <w:t>The development runs of the three model approaches</w:t>
             </w:r>
           </w:p>
         </w:tc>
@@ -12713,7 +12798,7 @@
                 <w:b w:val="0"/>
                 <w:sz w:val="19"/>
               </w:rPr>
-              <w:t>P2 on dev01: same check and swap, 3 model calls, $0.0366</w:t>
+              <w:t>Our coordinator on dev01: same check and swap, 3 model calls, $0.0366</w:t>
             </w:r>
           </w:p>
         </w:tc>

</xml_diff>

<commit_message>
submission: screenshots of the running board, who it helps, how it runs and how it adapts
capture_dashboard.py starts the board on 127.0.0.1 with a clean demo state, runs the fixed rules
on the projector and pantry practice cases right after their decisions, and saves sharp 2x crops
of the decision trail and the stock counters. The deck's slide 9 now says who Plan B helps, that it
runs on one laptop with any model or none, and that one core runs three settings, next to a board
screenshot. Two backup slides show the pantry board and the interfaces. The poster's top row adds
the board screenshot between the story and the design, rows are sized to fill the page, headings
use a calm ink colour, and a "Why it matters" column covers safety, who it helps, how easy it is to
run and how it adapts. The docx gains sections 3.1 to 3.3 with two board screenshots.
</commit_message>
<xml_diff>
--- a/PEEAI_plan/submission/documentation/Plan_B_Project_Documentation.docx
+++ b/PEEAI_plan/submission/documentation/Plan_B_Project_Documentation.docx
@@ -364,7 +364,7 @@
         <w:rPr>
           <w:b w:val="0"/>
         </w:rPr>
-        <w:t xml:space="preserve"> keeps a backup open for free while a fact or an approval is pending, and checks are selective, so only a fact that could change the decision is verified. I built Plan B as a fictional local sandbox with a campus showcase, a community skills exchange and a fictional pantry. The final system was frozen and run on 6 new cases, written by a separate worker before the final freeze and locked in the same commit, before the first model call. The author of the code changes never read them. 59 of 60 runs met the expected outcome. Our coordinator met all 18 of its 18 runs, as did the two other model-based approaches, and the one miss was the fixed rules on a case where a volunteer runs late. No executed action broke a rule, because every change passes the gate. Six cases cannot rank the approaches. An earlier locked test of 12 cases (120 runs) found the defects fixed before the final freeze, and its cases are now development cases. Section 12 keeps that complete record. Everything is fictional and local, and no community pilot has been run.</w:t>
+        <w:t xml:space="preserve"> keeps a backup open for free while a fact or an approval is pending, and checks are selective, so only a fact that could change the decision is verified. I built Plan B as a fictional local sandbox with a campus showcase, a community skills exchange and a fictional pantry. It is meant for student organizers, clubs, volunteers and pantry staff, runs on one laptop with local storage, works with no model at all, and one core served all three settings. The final system was frozen and run on {cases} new cases, written by a separate worker before the final freeze and locked in the same commit, before the first model call. The author of the code changes never read them. 59 of 60 runs met the expected outcome. Our coordinator met all 18 of its 18 runs, as did the two other model-based approaches, and the one miss was the fixed rules on a case where a volunteer runs late. No executed action broke a rule, because every change passes the gate. Six cases cannot rank the approaches. An earlier locked test of 12 cases (120 runs) found the defects fixed before the final freeze, and its cases are now development cases. Section 12 keeps that complete record. Everything is fictional and local, and no community pilot has been run.</w:t>
       </w:r>
     </w:p>
     <w:p>
@@ -1135,7 +1135,231 @@
         <w:rPr>
           <w:b w:val="0"/>
         </w:rPr>
-        <w:t>, which later sections cite.</w:t>
+        <w:t xml:space="preserve">, which later sections cite. The packets and the plan are kept in the development repository, https://github.com/nocdoggo/COLLIE (branch </w:t>
+      </w:r>
+      <w:r>
+        <w:rPr>
+          <w:rStyle w:val="InlineCode"/>
+        </w:rPr>
+        <w:t>hackathon/peeaai-plan</w:t>
+      </w:r>
+      <w:r>
+        <w:rPr>
+          <w:b w:val="0"/>
+        </w:rPr>
+        <w:t>). The hackathon repository keeps the app and these final files.</w:t>
+      </w:r>
+    </w:p>
+    <w:p>
+      <w:pPr>
+        <w:pStyle w:val="Heading2"/>
+      </w:pPr>
+      <w:r>
+        <w:t>3.1 Who it helps</w:t>
+      </w:r>
+    </w:p>
+    <w:p>
+      <w:r>
+        <w:rPr>
+          <w:b w:val="0"/>
+        </w:rPr>
+        <w:t>Plan B is meant for the people who keep community events running with little time: student organizers, clubs, campus offices, volunteers and the staff of a food pantry. For them it means fewer last-minute scrambles, no surprise spending, and a receipt for every change, so anyone can see later what changed and why. Participants can help too: a volunteer checks in from a phone link, and a partner can offer a listed resource, without any right to spend or to change the plan.</w:t>
+      </w:r>
+    </w:p>
+    <w:p>
+      <w:pPr>
+        <w:pStyle w:val="Heading2"/>
+      </w:pPr>
+      <w:r>
+        <w:t>3.2 Easy to deploy</w:t>
+      </w:r>
+    </w:p>
+    <w:p>
+      <w:pPr>
+        <w:pStyle w:val="ListBullet"/>
+      </w:pPr>
+      <w:r>
+        <w:rPr>
+          <w:b/>
+        </w:rPr>
+        <w:t>One laptop.</w:t>
+      </w:r>
+      <w:r>
+        <w:rPr>
+          <w:b w:val="0"/>
+        </w:rPr>
+        <w:t xml:space="preserve"> The server needs Python with uv and Node.js with npm. Install with two commands, then one command starts the board in a browser (section 14).</w:t>
+      </w:r>
+    </w:p>
+    <w:p>
+      <w:pPr>
+        <w:pStyle w:val="ListBullet"/>
+      </w:pPr>
+      <w:r>
+        <w:rPr>
+          <w:b/>
+        </w:rPr>
+        <w:t>Light and local.</w:t>
+      </w:r>
+      <w:r>
+        <w:rPr>
+          <w:b w:val="0"/>
+        </w:rPr>
+        <w:t xml:space="preserve"> Its runtime libraries are FastAPI, uvicorn and Pydantic, and its data is one local SQLite file. There is no cloud service to set up.</w:t>
+      </w:r>
+    </w:p>
+    <w:p>
+      <w:pPr>
+        <w:pStyle w:val="ListBullet"/>
+      </w:pPr>
+      <w:r>
+        <w:rPr>
+          <w:b/>
+        </w:rPr>
+        <w:t>A model is optional.</w:t>
+      </w:r>
+      <w:r>
+        <w:rPr>
+          <w:b w:val="0"/>
+        </w:rPr>
+        <w:t xml:space="preserve"> The fixed-rules policy runs with no model and no network. Any OpenAI-compatible endpoint can serve the model policies. The one used here was Claude Sonnet 5.5 through OpenRouter, with a spend cap.</w:t>
+      </w:r>
+    </w:p>
+    <w:p>
+      <w:pPr>
+        <w:pStyle w:val="ListBullet"/>
+      </w:pPr>
+      <w:r>
+        <w:rPr>
+          <w:b/>
+        </w:rPr>
+        <w:t>Safe to try.</w:t>
+      </w:r>
+      <w:r>
+        <w:rPr>
+          <w:b w:val="0"/>
+        </w:rPr>
+        <w:t xml:space="preserve"> Everything happens in a sandbox, and the moderator can reset an episode at any time.</w:t>
+      </w:r>
+    </w:p>
+    <w:p>
+      <w:pPr>
+        <w:keepNext/>
+        <w:jc w:val="center"/>
+      </w:pPr>
+      <w:r>
+        <w:drawing>
+          <wp:inline xmlns:a="http://schemas.openxmlformats.org/drawingml/2006/main" xmlns:pic="http://schemas.openxmlformats.org/drawingml/2006/picture">
+            <wp:extent cx="5486400" cy="3902927"/>
+            <wp:docPr id="4" name="Picture 4"/>
+            <wp:cNvGraphicFramePr>
+              <a:graphicFrameLocks noChangeAspect="1"/>
+            </wp:cNvGraphicFramePr>
+            <a:graphic>
+              <a:graphicData uri="http://schemas.openxmlformats.org/drawingml/2006/picture">
+                <pic:pic>
+                  <pic:nvPicPr>
+                    <pic:cNvPr id="0" name="shot_campus_trail.png"/>
+                    <pic:cNvPicPr/>
+                  </pic:nvPicPr>
+                  <pic:blipFill>
+                    <a:blip r:embed="rId14"/>
+                    <a:stretch>
+                      <a:fillRect/>
+                    </a:stretch>
+                  </pic:blipFill>
+                  <pic:spPr>
+                    <a:xfrm>
+                      <a:off x="0" y="0"/>
+                      <a:ext cx="5486400" cy="3902927"/>
+                    </a:xfrm>
+                    <a:prstGeom prst="rect"/>
+                  </pic:spPr>
+                </pic:pic>
+              </a:graphicData>
+            </a:graphic>
+          </wp:inline>
+        </w:drawing>
+      </w:r>
+    </w:p>
+    <w:p>
+      <w:pPr>
+        <w:pStyle w:val="Caption"/>
+        <w:jc w:val="center"/>
+      </w:pPr>
+      <w:r>
+        <w:rPr>
+          <w:b w:val="0"/>
+        </w:rPr>
+        <w:t>Figure 3a. The running board at 16:43, newest entry on top: the status check, the decision, the change and its receipt (screenshot of the projector practice case, fixed rules).</w:t>
+      </w:r>
+    </w:p>
+    <w:p>
+      <w:pPr>
+        <w:pStyle w:val="Heading2"/>
+      </w:pPr>
+      <w:r>
+        <w:t>3.3 Adaptive and versatile</w:t>
+      </w:r>
+    </w:p>
+    <w:p>
+      <w:r>
+        <w:rPr>
+          <w:b w:val="0"/>
+        </w:rPr>
+        <w:t>One core runs different settings. The campus showcase and the community skills exchange are two event configurations of the same event model: a new event of that kind is a configuration file with its activities, people, resources, rules and budget. A new domain needs an adapter for its own rules. The food pantry added one for stock, where late stock does not count and only staff record a handoff or a distribution, and it reused the same decision loop, gate and receipts. The policies are interchangeable too: fixed rules, a model that calls tools freely, or the coordinator that picks checked options, behind the same gate.</w:t>
+      </w:r>
+    </w:p>
+    <w:p>
+      <w:pPr>
+        <w:keepNext/>
+        <w:jc w:val="center"/>
+      </w:pPr>
+      <w:r>
+        <w:drawing>
+          <wp:inline xmlns:a="http://schemas.openxmlformats.org/drawingml/2006/main" xmlns:pic="http://schemas.openxmlformats.org/drawingml/2006/picture">
+            <wp:extent cx="5486400" cy="4348976"/>
+            <wp:docPr id="5" name="Picture 5"/>
+            <wp:cNvGraphicFramePr>
+              <a:graphicFrameLocks noChangeAspect="1"/>
+            </wp:cNvGraphicFramePr>
+            <a:graphic>
+              <a:graphicData uri="http://schemas.openxmlformats.org/drawingml/2006/picture">
+                <pic:pic>
+                  <pic:nvPicPr>
+                    <pic:cNvPr id="0" name="shot_pantry_trail.png"/>
+                    <pic:cNvPicPr/>
+                  </pic:nvPicPr>
+                  <pic:blipFill>
+                    <a:blip r:embed="rId15"/>
+                    <a:stretch>
+                      <a:fillRect/>
+                    </a:stretch>
+                  </pic:blipFill>
+                  <pic:spPr>
+                    <a:xfrm>
+                      <a:off x="0" y="0"/>
+                      <a:ext cx="5486400" cy="4348976"/>
+                    </a:xfrm>
+                    <a:prstGeom prst="rect"/>
+                  </pic:spPr>
+                </pic:pic>
+              </a:graphicData>
+            </a:graphic>
+          </wp:inline>
+        </w:drawing>
+      </w:r>
+    </w:p>
+    <w:p>
+      <w:pPr>
+        <w:pStyle w:val="Caption"/>
+        <w:jc w:val="center"/>
+      </w:pPr>
+      <w:r>
+        <w:rPr>
+          <w:b w:val="0"/>
+        </w:rPr>
+        <w:t>Figure 3b. The same board running the fictional pantry: check, hold the partner's 16 kits, ask staff for the handoff, receipt (screenshot of a practice case, fixed rules).</w:t>
       </w:r>
     </w:p>
     <w:p>
@@ -1373,7 +1597,7 @@
         <w:drawing>
           <wp:inline xmlns:a="http://schemas.openxmlformats.org/drawingml/2006/main" xmlns:pic="http://schemas.openxmlformats.org/drawingml/2006/picture">
             <wp:extent cx="5943600" cy="2327313"/>
-            <wp:docPr id="4" name="Picture 4"/>
+            <wp:docPr id="6" name="Picture 6"/>
             <wp:cNvGraphicFramePr>
               <a:graphicFrameLocks noChangeAspect="1"/>
             </wp:cNvGraphicFramePr>
@@ -1385,7 +1609,7 @@
                     <pic:cNvPicPr/>
                   </pic:nvPicPr>
                   <pic:blipFill>
-                    <a:blip r:embed="rId14"/>
+                    <a:blip r:embed="rId16"/>
                     <a:stretch>
                       <a:fillRect/>
                     </a:stretch>
@@ -1526,7 +1750,7 @@
         <w:drawing>
           <wp:inline xmlns:a="http://schemas.openxmlformats.org/drawingml/2006/main" xmlns:pic="http://schemas.openxmlformats.org/drawingml/2006/picture">
             <wp:extent cx="5943600" cy="2914598"/>
-            <wp:docPr id="5" name="Picture 5"/>
+            <wp:docPr id="7" name="Picture 7"/>
             <wp:cNvGraphicFramePr>
               <a:graphicFrameLocks noChangeAspect="1"/>
             </wp:cNvGraphicFramePr>
@@ -1538,7 +1762,7 @@
                     <pic:cNvPicPr/>
                   </pic:nvPicPr>
                   <pic:blipFill>
-                    <a:blip r:embed="rId15"/>
+                    <a:blip r:embed="rId17"/>
                     <a:stretch>
                       <a:fillRect/>
                     </a:stretch>
@@ -2346,7 +2570,7 @@
         <w:drawing>
           <wp:inline xmlns:a="http://schemas.openxmlformats.org/drawingml/2006/main" xmlns:pic="http://schemas.openxmlformats.org/drawingml/2006/picture">
             <wp:extent cx="5943600" cy="2614150"/>
-            <wp:docPr id="6" name="Picture 6"/>
+            <wp:docPr id="8" name="Picture 8"/>
             <wp:cNvGraphicFramePr>
               <a:graphicFrameLocks noChangeAspect="1"/>
             </wp:cNvGraphicFramePr>
@@ -2358,7 +2582,7 @@
                     <pic:cNvPicPr/>
                   </pic:nvPicPr>
                   <pic:blipFill>
-                    <a:blip r:embed="rId16"/>
+                    <a:blip r:embed="rId18"/>
                     <a:stretch>
                       <a:fillRect/>
                     </a:stretch>
@@ -3073,7 +3297,7 @@
         <w:drawing>
           <wp:inline xmlns:a="http://schemas.openxmlformats.org/drawingml/2006/main" xmlns:pic="http://schemas.openxmlformats.org/drawingml/2006/picture">
             <wp:extent cx="4572000" cy="3700431"/>
-            <wp:docPr id="7" name="Picture 7"/>
+            <wp:docPr id="9" name="Picture 9"/>
             <wp:cNvGraphicFramePr>
               <a:graphicFrameLocks noChangeAspect="1"/>
             </wp:cNvGraphicFramePr>
@@ -3085,7 +3309,7 @@
                     <pic:cNvPicPr/>
                   </pic:nvPicPr>
                   <pic:blipFill>
-                    <a:blip r:embed="rId17"/>
+                    <a:blip r:embed="rId19"/>
                     <a:stretch>
                       <a:fillRect/>
                     </a:stretch>
@@ -3237,7 +3461,7 @@
         <w:drawing>
           <wp:inline xmlns:a="http://schemas.openxmlformats.org/drawingml/2006/main" xmlns:pic="http://schemas.openxmlformats.org/drawingml/2006/picture">
             <wp:extent cx="5943600" cy="2935535"/>
-            <wp:docPr id="8" name="Picture 8"/>
+            <wp:docPr id="10" name="Picture 10"/>
             <wp:cNvGraphicFramePr>
               <a:graphicFrameLocks noChangeAspect="1"/>
             </wp:cNvGraphicFramePr>
@@ -3249,7 +3473,7 @@
                     <pic:cNvPicPr/>
                   </pic:nvPicPr>
                   <pic:blipFill>
-                    <a:blip r:embed="rId18"/>
+                    <a:blip r:embed="rId20"/>
                     <a:stretch>
                       <a:fillRect/>
                     </a:stretch>
@@ -3573,7 +3797,7 @@
         <w:drawing>
           <wp:inline xmlns:a="http://schemas.openxmlformats.org/drawingml/2006/main" xmlns:pic="http://schemas.openxmlformats.org/drawingml/2006/picture">
             <wp:extent cx="5943600" cy="852655"/>
-            <wp:docPr id="9" name="Picture 9"/>
+            <wp:docPr id="11" name="Picture 11"/>
             <wp:cNvGraphicFramePr>
               <a:graphicFrameLocks noChangeAspect="1"/>
             </wp:cNvGraphicFramePr>
@@ -3585,7 +3809,7 @@
                     <pic:cNvPicPr/>
                   </pic:nvPicPr>
                   <pic:blipFill>
-                    <a:blip r:embed="rId19"/>
+                    <a:blip r:embed="rId21"/>
                     <a:stretch>
                       <a:fillRect/>
                     </a:stretch>
@@ -4491,7 +4715,7 @@
         <w:drawing>
           <wp:inline xmlns:a="http://schemas.openxmlformats.org/drawingml/2006/main" xmlns:pic="http://schemas.openxmlformats.org/drawingml/2006/picture">
             <wp:extent cx="5943600" cy="2136235"/>
-            <wp:docPr id="10" name="Picture 10"/>
+            <wp:docPr id="12" name="Picture 12"/>
             <wp:cNvGraphicFramePr>
               <a:graphicFrameLocks noChangeAspect="1"/>
             </wp:cNvGraphicFramePr>
@@ -4503,7 +4727,7 @@
                     <pic:cNvPicPr/>
                   </pic:nvPicPr>
                   <pic:blipFill>
-                    <a:blip r:embed="rId20"/>
+                    <a:blip r:embed="rId22"/>
                     <a:stretch>
                       <a:fillRect/>
                     </a:stretch>
@@ -4615,7 +4839,7 @@
         <w:drawing>
           <wp:inline xmlns:a="http://schemas.openxmlformats.org/drawingml/2006/main" xmlns:pic="http://schemas.openxmlformats.org/drawingml/2006/picture">
             <wp:extent cx="5943600" cy="2140129"/>
-            <wp:docPr id="11" name="Picture 11"/>
+            <wp:docPr id="13" name="Picture 13"/>
             <wp:cNvGraphicFramePr>
               <a:graphicFrameLocks noChangeAspect="1"/>
             </wp:cNvGraphicFramePr>
@@ -4627,7 +4851,7 @@
                     <pic:cNvPicPr/>
                   </pic:nvPicPr>
                   <pic:blipFill>
-                    <a:blip r:embed="rId21"/>
+                    <a:blip r:embed="rId23"/>
                     <a:stretch>
                       <a:fillRect/>
                     </a:stretch>
@@ -7261,7 +7485,7 @@
         <w:drawing>
           <wp:inline xmlns:a="http://schemas.openxmlformats.org/drawingml/2006/main" xmlns:pic="http://schemas.openxmlformats.org/drawingml/2006/picture">
             <wp:extent cx="5943600" cy="1138444"/>
-            <wp:docPr id="12" name="Picture 12"/>
+            <wp:docPr id="14" name="Picture 14"/>
             <wp:cNvGraphicFramePr>
               <a:graphicFrameLocks noChangeAspect="1"/>
             </wp:cNvGraphicFramePr>
@@ -7273,7 +7497,7 @@
                     <pic:cNvPicPr/>
                   </pic:nvPicPr>
                   <pic:blipFill>
-                    <a:blip r:embed="rId22"/>
+                    <a:blip r:embed="rId24"/>
                     <a:stretch>
                       <a:fillRect/>
                     </a:stretch>
@@ -11037,7 +11261,7 @@
         <w:drawing>
           <wp:inline xmlns:a="http://schemas.openxmlformats.org/drawingml/2006/main" xmlns:pic="http://schemas.openxmlformats.org/drawingml/2006/picture">
             <wp:extent cx="5943600" cy="1746391"/>
-            <wp:docPr id="13" name="Picture 13"/>
+            <wp:docPr id="15" name="Picture 15"/>
             <wp:cNvGraphicFramePr>
               <a:graphicFrameLocks noChangeAspect="1"/>
             </wp:cNvGraphicFramePr>
@@ -11049,7 +11273,7 @@
                     <pic:cNvPicPr/>
                   </pic:nvPicPr>
                   <pic:blipFill>
-                    <a:blip r:embed="rId23"/>
+                    <a:blip r:embed="rId25"/>
                     <a:stretch>
                       <a:fillRect/>
                     </a:stretch>
@@ -12581,7 +12805,7 @@
                 <w:b w:val="0"/>
                 <w:sz w:val="19"/>
               </w:rPr>
-              <w:t>The plan: protocol, presentation plan, wave tasks</w:t>
+              <w:t>The plan: protocol, presentation plan, wave tasks (development repository only)</w:t>
             </w:r>
           </w:p>
         </w:tc>
@@ -12620,7 +12844,7 @@
                 <w:b w:val="0"/>
                 <w:sz w:val="19"/>
               </w:rPr>
-              <w:t>The audit packets of each wave, with their evidence</w:t>
+              <w:t>The audit packets of each wave, with their evidence (development repository only)</w:t>
             </w:r>
           </w:p>
         </w:tc>
@@ -12659,7 +12883,7 @@
                 <w:b w:val="0"/>
                 <w:sz w:val="19"/>
               </w:rPr>
-              <w:t>These submission items and their sources</w:t>
+              <w:t>These submission items (their sources are in the development repository)</w:t>
             </w:r>
           </w:p>
         </w:tc>

</xml_diff>

<commit_message>
submission: Noctis Zhang, Zhen Lu and Yinzhi Jin as the authors of the slides, the poster and the documentation
</commit_message>
<xml_diff>
--- a/PEEAI_plan/submission/documentation/Plan_B_Project_Documentation.docx
+++ b/PEEAI_plan/submission/documentation/Plan_B_Project_Documentation.docx
@@ -94,16 +94,40 @@
         </w:rPr>
         <w:t>Noctis Zhang</w:t>
       </w:r>
-    </w:p>
-    <w:p>
-      <w:pPr>
-        <w:spacing w:after="0"/>
-      </w:pPr>
       <w:r>
         <w:rPr>
           <w:b w:val="0"/>
         </w:rPr>
-        <w:t>Department of Computer Science, University of Massachusetts Boston</w:t>
+        <w:t xml:space="preserve"> and </w:t>
+      </w:r>
+      <w:r>
+        <w:rPr>
+          <w:b/>
+        </w:rPr>
+        <w:t>Zhen Lu</w:t>
+      </w:r>
+      <w:r>
+        <w:rPr>
+          <w:b w:val="0"/>
+        </w:rPr>
+        <w:t>, Department of Computer Science, University of Massachusetts Boston</w:t>
+      </w:r>
+    </w:p>
+    <w:p>
+      <w:pPr>
+        <w:spacing w:after="0"/>
+      </w:pPr>
+      <w:r>
+        <w:rPr>
+          <w:b/>
+        </w:rPr>
+        <w:t>Yinzhi Jin</w:t>
+      </w:r>
+      <w:r>
+        <w:rPr>
+          <w:b w:val="0"/>
+        </w:rPr>
+        <w:t>, Department of Management Information Systems, Carnegie Mellon University</w:t>
       </w:r>
     </w:p>
     <w:p>

</xml_diff>